<commit_message>
eval cambiado a true para ejecucion de los codigos
</commit_message>
<xml_diff>
--- a/_site/python/2021-05-31-02-variables-expresiones-y-statements-con-python/index.docx
+++ b/_site/python/2021-05-31-02-variables-expresiones-y-statements-con-python/index.docx
@@ -1075,6 +1075,44 @@
         <w:t xml:space="preserve"># &lt;class 'bool'&gt;</w:t>
       </w:r>
     </w:p>
+    <w:p>
+      <w:pPr>
+        <w:pStyle w:val="SourceCode"/>
+      </w:pPr>
+      <w:r>
+        <w:rPr>
+          <w:rStyle w:val="VerbatimChar"/>
+        </w:rPr>
+        <w:t xml:space="preserve">&lt;class 'int'&gt;</w:t>
+      </w:r>
+      <w:r>
+        <w:br/>
+      </w:r>
+      <w:r>
+        <w:rPr>
+          <w:rStyle w:val="VerbatimChar"/>
+        </w:rPr>
+        <w:t xml:space="preserve">&lt;class 'float'&gt;</w:t>
+      </w:r>
+      <w:r>
+        <w:br/>
+      </w:r>
+      <w:r>
+        <w:rPr>
+          <w:rStyle w:val="VerbatimChar"/>
+        </w:rPr>
+        <w:t xml:space="preserve">&lt;class 'str'&gt;</w:t>
+      </w:r>
+      <w:r>
+        <w:br/>
+      </w:r>
+      <w:r>
+        <w:rPr>
+          <w:rStyle w:val="VerbatimChar"/>
+        </w:rPr>
+        <w:t xml:space="preserve">&lt;class 'bool'&gt;</w:t>
+      </w:r>
+    </w:p>
     <w:bookmarkEnd w:id="32"/>
     <w:bookmarkStart w:id="33" w:name="conversión-entre-tipos"/>
     <w:p>
@@ -1445,6 +1483,44 @@
     </w:p>
     <w:p>
       <w:pPr>
+        <w:pStyle w:val="SourceCode"/>
+      </w:pPr>
+      <w:r>
+        <w:rPr>
+          <w:rStyle w:val="VerbatimChar"/>
+        </w:rPr>
+        <w:t xml:space="preserve">3</w:t>
+      </w:r>
+      <w:r>
+        <w:br/>
+      </w:r>
+      <w:r>
+        <w:rPr>
+          <w:rStyle w:val="VerbatimChar"/>
+        </w:rPr>
+        <w:t xml:space="preserve">7.0</w:t>
+      </w:r>
+      <w:r>
+        <w:br/>
+      </w:r>
+      <w:r>
+        <w:rPr>
+          <w:rStyle w:val="VerbatimChar"/>
+        </w:rPr>
+        <w:t xml:space="preserve">El año es: 2023</w:t>
+      </w:r>
+      <w:r>
+        <w:br/>
+      </w:r>
+      <w:r>
+        <w:rPr>
+          <w:rStyle w:val="VerbatimChar"/>
+        </w:rPr>
+        <w:t xml:space="preserve">3.75</w:t>
+      </w:r>
+    </w:p>
+    <w:p>
+      <w:pPr>
         <w:pStyle w:val="FirstParagraph"/>
       </w:pPr>
       <w:r>
@@ -1703,6 +1779,53 @@
           <w:rStyle w:val="CommentTok"/>
         </w:rPr>
         <w:t xml:space="preserve"># Resultado: 4</w:t>
+      </w:r>
+    </w:p>
+    <w:p>
+      <w:pPr>
+        <w:pStyle w:val="SourceCode"/>
+      </w:pPr>
+      <w:r>
+        <w:rPr>
+          <w:rStyle w:val="VerbatimChar"/>
+        </w:rPr>
+        <w:t xml:space="preserve">4</w:t>
+      </w:r>
+      <w:r>
+        <w:br/>
+      </w:r>
+      <w:r>
+        <w:rPr>
+          <w:rStyle w:val="VerbatimChar"/>
+        </w:rPr>
+        <w:t xml:space="preserve">4</w:t>
+      </w:r>
+      <w:r>
+        <w:br/>
+      </w:r>
+      <w:r>
+        <w:rPr>
+          <w:rStyle w:val="VerbatimChar"/>
+        </w:rPr>
+        <w:t xml:space="preserve">-4</w:t>
+      </w:r>
+      <w:r>
+        <w:br/>
+      </w:r>
+      <w:r>
+        <w:rPr>
+          <w:rStyle w:val="VerbatimChar"/>
+        </w:rPr>
+        <w:t xml:space="preserve">5</w:t>
+      </w:r>
+      <w:r>
+        <w:br/>
+      </w:r>
+      <w:r>
+        <w:rPr>
+          <w:rStyle w:val="VerbatimChar"/>
+        </w:rPr>
+        <w:t xml:space="preserve">4</w:t>
       </w:r>
     </w:p>
     <w:bookmarkEnd w:id="33"/>
@@ -2078,6 +2201,62 @@
           <w:rStyle w:val="NormalTok"/>
         </w:rPr>
         <w:t xml:space="preserve">(ipc))</w:t>
+      </w:r>
+    </w:p>
+    <w:p>
+      <w:pPr>
+        <w:pStyle w:val="SourceCode"/>
+      </w:pPr>
+      <w:r>
+        <w:rPr>
+          <w:rStyle w:val="VerbatimChar"/>
+        </w:rPr>
+        <w:t xml:space="preserve">Cálculo del Índice de Precios al Consumidor</w:t>
+      </w:r>
+      <w:r>
+        <w:br/>
+      </w:r>
+      <w:r>
+        <w:rPr>
+          <w:rStyle w:val="VerbatimChar"/>
+        </w:rPr>
+        <w:t xml:space="preserve">Año base: 2020</w:t>
+      </w:r>
+      <w:r>
+        <w:br/>
+      </w:r>
+      <w:r>
+        <w:rPr>
+          <w:rStyle w:val="VerbatimChar"/>
+        </w:rPr>
+        <w:t xml:space="preserve">Precio canasta base: S/ 750.0</w:t>
+      </w:r>
+      <w:r>
+        <w:br/>
+      </w:r>
+      <w:r>
+        <w:rPr>
+          <w:rStyle w:val="VerbatimChar"/>
+        </w:rPr>
+        <w:t xml:space="preserve">Precio canasta actual: S/ 850.5</w:t>
+      </w:r>
+      <w:r>
+        <w:br/>
+      </w:r>
+      <w:r>
+        <w:rPr>
+          <w:rStyle w:val="VerbatimChar"/>
+        </w:rPr>
+        <w:t xml:space="preserve">IPC: 113.4</w:t>
+      </w:r>
+      <w:r>
+        <w:br/>
+      </w:r>
+      <w:r>
+        <w:rPr>
+          <w:rStyle w:val="VerbatimChar"/>
+        </w:rPr>
+        <w:t xml:space="preserve">Tipo de dato del IPC: &lt;class 'float'&gt;</w:t>
       </w:r>
     </w:p>
     <w:bookmarkEnd w:id="34"/>
@@ -2790,7 +2969,130 @@
         <w:rPr>
           <w:rStyle w:val="CommentTok"/>
         </w:rPr>
-        <w:t xml:space="preserve"># Variable que indica uso interno</w:t>
+        <w:t xml:space="preserve"># Primero definimos las variables necesarias</w:t>
+      </w:r>
+      <w:r>
+        <w:br/>
+      </w:r>
+      <w:r>
+        <w:rPr>
+          <w:rStyle w:val="NormalTok"/>
+        </w:rPr>
+        <w:t xml:space="preserve">precio_unitario </w:t>
+      </w:r>
+      <w:r>
+        <w:rPr>
+          <w:rStyle w:val="OperatorTok"/>
+        </w:rPr>
+        <w:t xml:space="preserve">=</w:t>
+      </w:r>
+      <w:r>
+        <w:rPr>
+          <w:rStyle w:val="NormalTok"/>
+        </w:rPr>
+        <w:t xml:space="preserve"> </w:t>
+      </w:r>
+      <w:r>
+        <w:rPr>
+          <w:rStyle w:val="FloatTok"/>
+        </w:rPr>
+        <w:t xml:space="preserve">25.50</w:t>
+      </w:r>
+      <w:r>
+        <w:rPr>
+          <w:rStyle w:val="NormalTok"/>
+        </w:rPr>
+        <w:t xml:space="preserve">  </w:t>
+      </w:r>
+      <w:r>
+        <w:rPr>
+          <w:rStyle w:val="CommentTok"/>
+        </w:rPr>
+        <w:t xml:space="preserve"># precio de venta por unidad</w:t>
+      </w:r>
+      <w:r>
+        <w:br/>
+      </w:r>
+      <w:r>
+        <w:rPr>
+          <w:rStyle w:val="NormalTok"/>
+        </w:rPr>
+        <w:t xml:space="preserve">cantidad_vendida </w:t>
+      </w:r>
+      <w:r>
+        <w:rPr>
+          <w:rStyle w:val="OperatorTok"/>
+        </w:rPr>
+        <w:t xml:space="preserve">=</w:t>
+      </w:r>
+      <w:r>
+        <w:rPr>
+          <w:rStyle w:val="NormalTok"/>
+        </w:rPr>
+        <w:t xml:space="preserve"> </w:t>
+      </w:r>
+      <w:r>
+        <w:rPr>
+          <w:rStyle w:val="DecValTok"/>
+        </w:rPr>
+        <w:t xml:space="preserve">120</w:t>
+      </w:r>
+      <w:r>
+        <w:rPr>
+          <w:rStyle w:val="NormalTok"/>
+        </w:rPr>
+        <w:t xml:space="preserve">  </w:t>
+      </w:r>
+      <w:r>
+        <w:rPr>
+          <w:rStyle w:val="CommentTok"/>
+        </w:rPr>
+        <w:t xml:space="preserve"># unidades vendidas</w:t>
+      </w:r>
+      <w:r>
+        <w:br/>
+      </w:r>
+      <w:r>
+        <w:br/>
+      </w:r>
+      <w:r>
+        <w:rPr>
+          <w:rStyle w:val="CommentTok"/>
+        </w:rPr>
+        <w:t xml:space="preserve"># Ahora sí podemos calcular</w:t>
+      </w:r>
+      <w:r>
+        <w:br/>
+      </w:r>
+      <w:r>
+        <w:rPr>
+          <w:rStyle w:val="NormalTok"/>
+        </w:rPr>
+        <w:t xml:space="preserve">_calculo_intermedio </w:t>
+      </w:r>
+      <w:r>
+        <w:rPr>
+          <w:rStyle w:val="OperatorTok"/>
+        </w:rPr>
+        <w:t xml:space="preserve">=</w:t>
+      </w:r>
+      <w:r>
+        <w:rPr>
+          <w:rStyle w:val="NormalTok"/>
+        </w:rPr>
+        <w:t xml:space="preserve"> precio_unitario </w:t>
+      </w:r>
+      <w:r>
+        <w:rPr>
+          <w:rStyle w:val="OperatorTok"/>
+        </w:rPr>
+        <w:t xml:space="preserve">*</w:t>
+      </w:r>
+      <w:r>
+        <w:rPr>
+          <w:rStyle w:val="NormalTok"/>
+        </w:rPr>
+        <w:t xml:space="preserve"> cantidad_vendida</w:t>
       </w:r>
       <w:r>
         <w:br/>
@@ -2820,37 +3122,270 @@
         <w:t xml:space="preserve">100</w:t>
       </w:r>
       <w:r>
-        <w:br/>
-      </w:r>
-      <w:r>
-        <w:rPr>
-          <w:rStyle w:val="NormalTok"/>
-        </w:rPr>
-        <w:t xml:space="preserve">_calculo_intermedio </w:t>
-      </w:r>
-      <w:r>
-        <w:rPr>
-          <w:rStyle w:val="OperatorTok"/>
-        </w:rPr>
-        <w:t xml:space="preserve">=</w:t>
-      </w:r>
-      <w:r>
-        <w:rPr>
-          <w:rStyle w:val="NormalTok"/>
-        </w:rPr>
-        <w:t xml:space="preserve"> precio </w:t>
-      </w:r>
-      <w:r>
-        <w:rPr>
-          <w:rStyle w:val="OperatorTok"/>
-        </w:rPr>
-        <w:t xml:space="preserve">*</w:t>
-      </w:r>
-      <w:r>
-        <w:rPr>
-          <w:rStyle w:val="NormalTok"/>
-        </w:rPr>
-        <w:t xml:space="preserve"> cantidad</w:t>
+        <w:rPr>
+          <w:rStyle w:val="NormalTok"/>
+        </w:rPr>
+        <w:t xml:space="preserve">  </w:t>
+      </w:r>
+      <w:r>
+        <w:rPr>
+          <w:rStyle w:val="CommentTok"/>
+        </w:rPr>
+        <w:t xml:space="preserve"># variable que solo usamos internamente</w:t>
+      </w:r>
+      <w:r>
+        <w:br/>
+      </w:r>
+      <w:r>
+        <w:br/>
+      </w:r>
+      <w:r>
+        <w:rPr>
+          <w:rStyle w:val="CommentTok"/>
+        </w:rPr>
+        <w:t xml:space="preserve"># Mostramos resultados (opcional, para que el lector vea)</w:t>
+      </w:r>
+      <w:r>
+        <w:br/>
+      </w:r>
+      <w:r>
+        <w:rPr>
+          <w:rStyle w:val="BuiltInTok"/>
+        </w:rPr>
+        <w:t xml:space="preserve">print</w:t>
+      </w:r>
+      <w:r>
+        <w:rPr>
+          <w:rStyle w:val="NormalTok"/>
+        </w:rPr>
+        <w:t xml:space="preserve">(</w:t>
+      </w:r>
+      <w:r>
+        <w:rPr>
+          <w:rStyle w:val="SpecialStringTok"/>
+        </w:rPr>
+        <w:t xml:space="preserve">f"Precio unitario: S/ </w:t>
+      </w:r>
+      <w:r>
+        <w:rPr>
+          <w:rStyle w:val="SpecialCharTok"/>
+        </w:rPr>
+        <w:t xml:space="preserve">{</w:t>
+      </w:r>
+      <w:r>
+        <w:rPr>
+          <w:rStyle w:val="NormalTok"/>
+        </w:rPr>
+        <w:t xml:space="preserve">precio_unitario</w:t>
+      </w:r>
+      <w:r>
+        <w:rPr>
+          <w:rStyle w:val="SpecialCharTok"/>
+        </w:rPr>
+        <w:t xml:space="preserve">:,.2f}</w:t>
+      </w:r>
+      <w:r>
+        <w:rPr>
+          <w:rStyle w:val="SpecialStringTok"/>
+        </w:rPr>
+        <w:t xml:space="preserve">"</w:t>
+      </w:r>
+      <w:r>
+        <w:rPr>
+          <w:rStyle w:val="NormalTok"/>
+        </w:rPr>
+        <w:t xml:space="preserve">)</w:t>
+      </w:r>
+      <w:r>
+        <w:br/>
+      </w:r>
+      <w:r>
+        <w:rPr>
+          <w:rStyle w:val="BuiltInTok"/>
+        </w:rPr>
+        <w:t xml:space="preserve">print</w:t>
+      </w:r>
+      <w:r>
+        <w:rPr>
+          <w:rStyle w:val="NormalTok"/>
+        </w:rPr>
+        <w:t xml:space="preserve">(</w:t>
+      </w:r>
+      <w:r>
+        <w:rPr>
+          <w:rStyle w:val="SpecialStringTok"/>
+        </w:rPr>
+        <w:t xml:space="preserve">f"Cantidad vendida: </w:t>
+      </w:r>
+      <w:r>
+        <w:rPr>
+          <w:rStyle w:val="SpecialCharTok"/>
+        </w:rPr>
+        <w:t xml:space="preserve">{</w:t>
+      </w:r>
+      <w:r>
+        <w:rPr>
+          <w:rStyle w:val="NormalTok"/>
+        </w:rPr>
+        <w:t xml:space="preserve">cantidad_vendida</w:t>
+      </w:r>
+      <w:r>
+        <w:rPr>
+          <w:rStyle w:val="SpecialCharTok"/>
+        </w:rPr>
+        <w:t xml:space="preserve">}</w:t>
+      </w:r>
+      <w:r>
+        <w:rPr>
+          <w:rStyle w:val="SpecialStringTok"/>
+        </w:rPr>
+        <w:t xml:space="preserve"> unidades"</w:t>
+      </w:r>
+      <w:r>
+        <w:rPr>
+          <w:rStyle w:val="NormalTok"/>
+        </w:rPr>
+        <w:t xml:space="preserve">)</w:t>
+      </w:r>
+      <w:r>
+        <w:br/>
+      </w:r>
+      <w:r>
+        <w:rPr>
+          <w:rStyle w:val="BuiltInTok"/>
+        </w:rPr>
+        <w:t xml:space="preserve">print</w:t>
+      </w:r>
+      <w:r>
+        <w:rPr>
+          <w:rStyle w:val="NormalTok"/>
+        </w:rPr>
+        <w:t xml:space="preserve">(</w:t>
+      </w:r>
+      <w:r>
+        <w:rPr>
+          <w:rStyle w:val="SpecialStringTok"/>
+        </w:rPr>
+        <w:t xml:space="preserve">f"Subtotal (cálculo intermedio): S/ </w:t>
+      </w:r>
+      <w:r>
+        <w:rPr>
+          <w:rStyle w:val="SpecialCharTok"/>
+        </w:rPr>
+        <w:t xml:space="preserve">{</w:t>
+      </w:r>
+      <w:r>
+        <w:rPr>
+          <w:rStyle w:val="NormalTok"/>
+        </w:rPr>
+        <w:t xml:space="preserve">_calculo_intermedio</w:t>
+      </w:r>
+      <w:r>
+        <w:rPr>
+          <w:rStyle w:val="SpecialCharTok"/>
+        </w:rPr>
+        <w:t xml:space="preserve">:,.2f}</w:t>
+      </w:r>
+      <w:r>
+        <w:rPr>
+          <w:rStyle w:val="SpecialStringTok"/>
+        </w:rPr>
+        <w:t xml:space="preserve">"</w:t>
+      </w:r>
+      <w:r>
+        <w:rPr>
+          <w:rStyle w:val="NormalTok"/>
+        </w:rPr>
+        <w:t xml:space="preserve">)</w:t>
+      </w:r>
+      <w:r>
+        <w:br/>
+      </w:r>
+      <w:r>
+        <w:rPr>
+          <w:rStyle w:val="BuiltInTok"/>
+        </w:rPr>
+        <w:t xml:space="preserve">print</w:t>
+      </w:r>
+      <w:r>
+        <w:rPr>
+          <w:rStyle w:val="NormalTok"/>
+        </w:rPr>
+        <w:t xml:space="preserve">(</w:t>
+      </w:r>
+      <w:r>
+        <w:rPr>
+          <w:rStyle w:val="SpecialStringTok"/>
+        </w:rPr>
+        <w:t xml:space="preserve">f"Valor temporal interno: </w:t>
+      </w:r>
+      <w:r>
+        <w:rPr>
+          <w:rStyle w:val="SpecialCharTok"/>
+        </w:rPr>
+        <w:t xml:space="preserve">{</w:t>
+      </w:r>
+      <w:r>
+        <w:rPr>
+          <w:rStyle w:val="NormalTok"/>
+        </w:rPr>
+        <w:t xml:space="preserve">_dato_temporal</w:t>
+      </w:r>
+      <w:r>
+        <w:rPr>
+          <w:rStyle w:val="SpecialCharTok"/>
+        </w:rPr>
+        <w:t xml:space="preserve">}</w:t>
+      </w:r>
+      <w:r>
+        <w:rPr>
+          <w:rStyle w:val="SpecialStringTok"/>
+        </w:rPr>
+        <w:t xml:space="preserve">"</w:t>
+      </w:r>
+      <w:r>
+        <w:rPr>
+          <w:rStyle w:val="NormalTok"/>
+        </w:rPr>
+        <w:t xml:space="preserve">)</w:t>
+      </w:r>
+    </w:p>
+    <w:p>
+      <w:pPr>
+        <w:pStyle w:val="SourceCode"/>
+      </w:pPr>
+      <w:r>
+        <w:rPr>
+          <w:rStyle w:val="VerbatimChar"/>
+        </w:rPr>
+        <w:t xml:space="preserve">Precio unitario: S/ 25.50</w:t>
+      </w:r>
+      <w:r>
+        <w:br/>
+      </w:r>
+      <w:r>
+        <w:rPr>
+          <w:rStyle w:val="VerbatimChar"/>
+        </w:rPr>
+        <w:t xml:space="preserve">Cantidad vendida: 120 unidades</w:t>
+      </w:r>
+      <w:r>
+        <w:br/>
+      </w:r>
+      <w:r>
+        <w:rPr>
+          <w:rStyle w:val="VerbatimChar"/>
+        </w:rPr>
+        <w:t xml:space="preserve">Subtotal (cálculo intermedio): S/ 3,060.00</w:t>
+      </w:r>
+      <w:r>
+        <w:br/>
+      </w:r>
+      <w:r>
+        <w:rPr>
+          <w:rStyle w:val="VerbatimChar"/>
+        </w:rPr>
+        <w:t xml:space="preserve">Valor temporal interno: 100</w:t>
       </w:r>
     </w:p>
     <w:bookmarkEnd w:id="38"/>
@@ -3152,6 +3687,98 @@
         <w:t xml:space="preserve">(i)</w:t>
       </w:r>
     </w:p>
+    <w:p>
+      <w:pPr>
+        <w:pStyle w:val="SourceCode"/>
+      </w:pPr>
+      <w:r>
+        <w:rPr>
+          <w:rStyle w:val="VerbatimChar"/>
+        </w:rPr>
+        <w:t xml:space="preserve">0</w:t>
+      </w:r>
+      <w:r>
+        <w:br/>
+      </w:r>
+      <w:r>
+        <w:rPr>
+          <w:rStyle w:val="VerbatimChar"/>
+        </w:rPr>
+        <w:t xml:space="preserve">1</w:t>
+      </w:r>
+      <w:r>
+        <w:br/>
+      </w:r>
+      <w:r>
+        <w:rPr>
+          <w:rStyle w:val="VerbatimChar"/>
+        </w:rPr>
+        <w:t xml:space="preserve">2</w:t>
+      </w:r>
+      <w:r>
+        <w:br/>
+      </w:r>
+      <w:r>
+        <w:rPr>
+          <w:rStyle w:val="VerbatimChar"/>
+        </w:rPr>
+        <w:t xml:space="preserve">3</w:t>
+      </w:r>
+      <w:r>
+        <w:br/>
+      </w:r>
+      <w:r>
+        <w:rPr>
+          <w:rStyle w:val="VerbatimChar"/>
+        </w:rPr>
+        <w:t xml:space="preserve">4</w:t>
+      </w:r>
+      <w:r>
+        <w:br/>
+      </w:r>
+      <w:r>
+        <w:rPr>
+          <w:rStyle w:val="VerbatimChar"/>
+        </w:rPr>
+        <w:t xml:space="preserve">5</w:t>
+      </w:r>
+      <w:r>
+        <w:br/>
+      </w:r>
+      <w:r>
+        <w:rPr>
+          <w:rStyle w:val="VerbatimChar"/>
+        </w:rPr>
+        <w:t xml:space="preserve">6</w:t>
+      </w:r>
+      <w:r>
+        <w:br/>
+      </w:r>
+      <w:r>
+        <w:rPr>
+          <w:rStyle w:val="VerbatimChar"/>
+        </w:rPr>
+        <w:t xml:space="preserve">7</w:t>
+      </w:r>
+      <w:r>
+        <w:br/>
+      </w:r>
+      <w:r>
+        <w:rPr>
+          <w:rStyle w:val="VerbatimChar"/>
+        </w:rPr>
+        <w:t xml:space="preserve">8</w:t>
+      </w:r>
+      <w:r>
+        <w:br/>
+      </w:r>
+      <w:r>
+        <w:rPr>
+          <w:rStyle w:val="VerbatimChar"/>
+        </w:rPr>
+        <w:t xml:space="preserve">9</w:t>
+      </w:r>
+    </w:p>
     <w:bookmarkEnd w:id="39"/>
     <w:bookmarkStart w:id="40" w:name="ejemplo-económico-completo"/>
     <w:p>
@@ -3897,6 +4524,53 @@
           <w:rStyle w:val="NormalTok"/>
         </w:rPr>
         <w:t xml:space="preserve">)</w:t>
+      </w:r>
+    </w:p>
+    <w:p>
+      <w:pPr>
+        <w:pStyle w:val="SourceCode"/>
+      </w:pPr>
+      <w:r>
+        <w:rPr>
+          <w:rStyle w:val="VerbatimChar"/>
+        </w:rPr>
+        <w:t xml:space="preserve">Análisis Económico - Perú (PER)</w:t>
+      </w:r>
+      <w:r>
+        <w:br/>
+      </w:r>
+      <w:r>
+        <w:rPr>
+          <w:rStyle w:val="VerbatimChar"/>
+        </w:rPr>
+        <w:t xml:space="preserve">PIB nominal: USD 242,632 millones</w:t>
+      </w:r>
+      <w:r>
+        <w:br/>
+      </w:r>
+      <w:r>
+        <w:rPr>
+          <w:rStyle w:val="VerbatimChar"/>
+        </w:rPr>
+        <w:t xml:space="preserve">Población: 33,715,471 habitantes</w:t>
+      </w:r>
+      <w:r>
+        <w:br/>
+      </w:r>
+      <w:r>
+        <w:rPr>
+          <w:rStyle w:val="VerbatimChar"/>
+        </w:rPr>
+        <w:t xml:space="preserve">PIB per cápita: USD 7,196.46</w:t>
+      </w:r>
+      <w:r>
+        <w:br/>
+      </w:r>
+      <w:r>
+        <w:rPr>
+          <w:rStyle w:val="VerbatimChar"/>
+        </w:rPr>
+        <w:t xml:space="preserve">Economía emergente: True</w:t>
       </w:r>
     </w:p>
     <w:bookmarkEnd w:id="40"/>
@@ -4856,6 +5530,71 @@
         <w:t xml:space="preserve"># 25</w:t>
       </w:r>
     </w:p>
+    <w:p>
+      <w:pPr>
+        <w:pStyle w:val="SourceCode"/>
+      </w:pPr>
+      <w:r>
+        <w:rPr>
+          <w:rStyle w:val="VerbatimChar"/>
+        </w:rPr>
+        <w:t xml:space="preserve">Ingreso total: 10500</w:t>
+      </w:r>
+      <w:r>
+        <w:br/>
+      </w:r>
+      <w:r>
+        <w:rPr>
+          <w:rStyle w:val="VerbatimChar"/>
+        </w:rPr>
+        <w:t xml:space="preserve">Ahorro: 1000</w:t>
+      </w:r>
+      <w:r>
+        <w:br/>
+      </w:r>
+      <w:r>
+        <w:rPr>
+          <w:rStyle w:val="VerbatimChar"/>
+        </w:rPr>
+        <w:t xml:space="preserve">Valor de venta: 2550.0</w:t>
+      </w:r>
+      <w:r>
+        <w:br/>
+      </w:r>
+      <w:r>
+        <w:rPr>
+          <w:rStyle w:val="VerbatimChar"/>
+        </w:rPr>
+        <w:t xml:space="preserve">PIB per cápita: 10.0</w:t>
+      </w:r>
+      <w:r>
+        <w:br/>
+      </w:r>
+      <w:r>
+        <w:rPr>
+          <w:rStyle w:val="VerbatimChar"/>
+        </w:rPr>
+        <w:t xml:space="preserve">Capital final: 11576.25</w:t>
+      </w:r>
+      <w:r>
+        <w:br/>
+      </w:r>
+      <w:r>
+        <w:rPr>
+          <w:rStyle w:val="VerbatimChar"/>
+        </w:rPr>
+        <w:t xml:space="preserve">Lotes completos: 13</w:t>
+      </w:r>
+      <w:r>
+        <w:br/>
+      </w:r>
+      <w:r>
+        <w:rPr>
+          <w:rStyle w:val="VerbatimChar"/>
+        </w:rPr>
+        <w:t xml:space="preserve">Unidades restantes: 25</w:t>
+      </w:r>
+    </w:p>
     <w:bookmarkEnd w:id="42"/>
     <w:bookmarkStart w:id="43" w:name="operadores-de-comparación"/>
     <w:p>
@@ -5261,6 +6000,62 @@
           <w:rStyle w:val="CommentTok"/>
         </w:rPr>
         <w:t xml:space="preserve"># False</w:t>
+      </w:r>
+    </w:p>
+    <w:p>
+      <w:pPr>
+        <w:pStyle w:val="SourceCode"/>
+      </w:pPr>
+      <w:r>
+        <w:rPr>
+          <w:rStyle w:val="VerbatimChar"/>
+        </w:rPr>
+        <w:t xml:space="preserve">False</w:t>
+      </w:r>
+      <w:r>
+        <w:br/>
+      </w:r>
+      <w:r>
+        <w:rPr>
+          <w:rStyle w:val="VerbatimChar"/>
+        </w:rPr>
+        <w:t xml:space="preserve">True</w:t>
+      </w:r>
+      <w:r>
+        <w:br/>
+      </w:r>
+      <w:r>
+        <w:rPr>
+          <w:rStyle w:val="VerbatimChar"/>
+        </w:rPr>
+        <w:t xml:space="preserve">True</w:t>
+      </w:r>
+      <w:r>
+        <w:br/>
+      </w:r>
+      <w:r>
+        <w:rPr>
+          <w:rStyle w:val="VerbatimChar"/>
+        </w:rPr>
+        <w:t xml:space="preserve">False</w:t>
+      </w:r>
+      <w:r>
+        <w:br/>
+      </w:r>
+      <w:r>
+        <w:rPr>
+          <w:rStyle w:val="VerbatimChar"/>
+        </w:rPr>
+        <w:t xml:space="preserve">True</w:t>
+      </w:r>
+      <w:r>
+        <w:br/>
+      </w:r>
+      <w:r>
+        <w:rPr>
+          <w:rStyle w:val="VerbatimChar"/>
+        </w:rPr>
+        <w:t xml:space="preserve">False</w:t>
       </w:r>
     </w:p>
     <w:bookmarkEnd w:id="43"/>
@@ -5766,6 +6561,35 @@
         <w:t xml:space="preserve"># False</w:t>
       </w:r>
     </w:p>
+    <w:p>
+      <w:pPr>
+        <w:pStyle w:val="SourceCode"/>
+      </w:pPr>
+      <w:r>
+        <w:rPr>
+          <w:rStyle w:val="VerbatimChar"/>
+        </w:rPr>
+        <w:t xml:space="preserve">Economía estable: True</w:t>
+      </w:r>
+      <w:r>
+        <w:br/>
+      </w:r>
+      <w:r>
+        <w:rPr>
+          <w:rStyle w:val="VerbatimChar"/>
+        </w:rPr>
+        <w:t xml:space="preserve">Hay problema económico: False</w:t>
+      </w:r>
+      <w:r>
+        <w:br/>
+      </w:r>
+      <w:r>
+        <w:rPr>
+          <w:rStyle w:val="VerbatimChar"/>
+        </w:rPr>
+        <w:t xml:space="preserve">En recesión: False</w:t>
+      </w:r>
+    </w:p>
     <w:bookmarkEnd w:id="44"/>
     <w:bookmarkStart w:id="45" w:name="operadores-de-asignación"/>
     <w:p>
@@ -6267,6 +7091,53 @@
           <w:rStyle w:val="CommentTok"/>
         </w:rPr>
         <w:t xml:space="preserve"># 8</w:t>
+      </w:r>
+    </w:p>
+    <w:p>
+      <w:pPr>
+        <w:pStyle w:val="SourceCode"/>
+      </w:pPr>
+      <w:r>
+        <w:rPr>
+          <w:rStyle w:val="VerbatimChar"/>
+        </w:rPr>
+        <w:t xml:space="preserve">Capital después de aporte: 11500</w:t>
+      </w:r>
+      <w:r>
+        <w:br/>
+      </w:r>
+      <w:r>
+        <w:rPr>
+          <w:rStyle w:val="VerbatimChar"/>
+        </w:rPr>
+        <w:t xml:space="preserve">Capital después de retiro: 9500</w:t>
+      </w:r>
+      <w:r>
+        <w:br/>
+      </w:r>
+      <w:r>
+        <w:rPr>
+          <w:rStyle w:val="VerbatimChar"/>
+        </w:rPr>
+        <w:t xml:space="preserve">Capital con interés: 9975.0</w:t>
+      </w:r>
+      <w:r>
+        <w:br/>
+      </w:r>
+      <w:r>
+        <w:rPr>
+          <w:rStyle w:val="VerbatimChar"/>
+        </w:rPr>
+        <w:t xml:space="preserve">Capital dividido: 4987.5</w:t>
+      </w:r>
+      <w:r>
+        <w:br/>
+      </w:r>
+      <w:r>
+        <w:rPr>
+          <w:rStyle w:val="VerbatimChar"/>
+        </w:rPr>
+        <w:t xml:space="preserve">Tasa al cubo: 8</w:t>
       </w:r>
     </w:p>
     <w:bookmarkEnd w:id="45"/>
@@ -6954,6 +7825,71 @@
           <w:rStyle w:val="NormalTok"/>
         </w:rPr>
         <w:t xml:space="preserve">)</w:t>
+      </w:r>
+    </w:p>
+    <w:p>
+      <w:pPr>
+        <w:pStyle w:val="SourceCode"/>
+      </w:pPr>
+      <w:r>
+        <w:rPr>
+          <w:rStyle w:val="VerbatimChar"/>
+        </w:rPr>
+        <w:t xml:space="preserve">Préstamo con Interés Compuesto</w:t>
+      </w:r>
+      <w:r>
+        <w:br/>
+      </w:r>
+      <w:r>
+        <w:rPr>
+          <w:rStyle w:val="VerbatimChar"/>
+        </w:rPr>
+        <w:t xml:space="preserve">Capital inicial: S/ 50,000.00</w:t>
+      </w:r>
+      <w:r>
+        <w:br/>
+      </w:r>
+      <w:r>
+        <w:rPr>
+          <w:rStyle w:val="VerbatimChar"/>
+        </w:rPr>
+        <w:t xml:space="preserve">Tasa anual: 8.0%</w:t>
+      </w:r>
+      <w:r>
+        <w:br/>
+      </w:r>
+      <w:r>
+        <w:rPr>
+          <w:rStyle w:val="VerbatimChar"/>
+        </w:rPr>
+        <w:t xml:space="preserve">Periodo: 5 años</w:t>
+      </w:r>
+      <w:r>
+        <w:br/>
+      </w:r>
+      <w:r>
+        <w:rPr>
+          <w:rStyle w:val="VerbatimChar"/>
+        </w:rPr>
+        <w:t xml:space="preserve">Capital final (método 1): S/ 73,466.40</w:t>
+      </w:r>
+      <w:r>
+        <w:br/>
+      </w:r>
+      <w:r>
+        <w:rPr>
+          <w:rStyle w:val="VerbatimChar"/>
+        </w:rPr>
+        <w:t xml:space="preserve">Capital final (método 2): S/ 73,466.40</w:t>
+      </w:r>
+      <w:r>
+        <w:br/>
+      </w:r>
+      <w:r>
+        <w:rPr>
+          <w:rStyle w:val="VerbatimChar"/>
+        </w:rPr>
+        <w:t xml:space="preserve">Intereses ganados: S/ 23,466.40</w:t>
       </w:r>
     </w:p>
     <w:bookmarkEnd w:id="46"/>
@@ -6992,6 +7928,72 @@
         <w:rPr>
           <w:rStyle w:val="CommentTok"/>
         </w:rPr>
+        <w:t xml:space="preserve"># Primero definimos las variables que vamos a usar</w:t>
+      </w:r>
+      <w:r>
+        <w:br/>
+      </w:r>
+      <w:r>
+        <w:rPr>
+          <w:rStyle w:val="NormalTok"/>
+        </w:rPr>
+        <w:t xml:space="preserve">precio </w:t>
+      </w:r>
+      <w:r>
+        <w:rPr>
+          <w:rStyle w:val="OperatorTok"/>
+        </w:rPr>
+        <w:t xml:space="preserve">=</w:t>
+      </w:r>
+      <w:r>
+        <w:rPr>
+          <w:rStyle w:val="NormalTok"/>
+        </w:rPr>
+        <w:t xml:space="preserve"> </w:t>
+      </w:r>
+      <w:r>
+        <w:rPr>
+          <w:rStyle w:val="FloatTok"/>
+        </w:rPr>
+        <w:t xml:space="preserve">25.50</w:t>
+      </w:r>
+      <w:r>
+        <w:br/>
+      </w:r>
+      <w:r>
+        <w:rPr>
+          <w:rStyle w:val="NormalTok"/>
+        </w:rPr>
+        <w:t xml:space="preserve">cantidad </w:t>
+      </w:r>
+      <w:r>
+        <w:rPr>
+          <w:rStyle w:val="OperatorTok"/>
+        </w:rPr>
+        <w:t xml:space="preserve">=</w:t>
+      </w:r>
+      <w:r>
+        <w:rPr>
+          <w:rStyle w:val="NormalTok"/>
+        </w:rPr>
+        <w:t xml:space="preserve"> </w:t>
+      </w:r>
+      <w:r>
+        <w:rPr>
+          <w:rStyle w:val="DecValTok"/>
+        </w:rPr>
+        <w:t xml:space="preserve">100</w:t>
+      </w:r>
+      <w:r>
+        <w:br/>
+      </w:r>
+      <w:r>
+        <w:br/>
+      </w:r>
+      <w:r>
+        <w:rPr>
+          <w:rStyle w:val="CommentTok"/>
+        </w:rPr>
         <w:t xml:space="preserve"># Expresiones numéricas</w:t>
       </w:r>
       <w:r>
@@ -7583,6 +8585,26 @@
         <w:t xml:space="preserve"># 2.00</w:t>
       </w:r>
     </w:p>
+    <w:p>
+      <w:pPr>
+        <w:pStyle w:val="SourceCode"/>
+      </w:pPr>
+      <w:r>
+        <w:rPr>
+          <w:rStyle w:val="VerbatimChar"/>
+        </w:rPr>
+        <w:t xml:space="preserve">Propensión marginal al consumo: 0.5</w:t>
+      </w:r>
+      <w:r>
+        <w:br/>
+      </w:r>
+      <w:r>
+        <w:rPr>
+          <w:rStyle w:val="VerbatimChar"/>
+        </w:rPr>
+        <w:t xml:space="preserve">Multiplicador keynesiano: 2.00</w:t>
+      </w:r>
+    </w:p>
     <w:bookmarkEnd w:id="49"/>
     <w:bookmarkStart w:id="50" w:name="expresiones-en-contexto-económico"/>
     <w:p>
@@ -8325,6 +9347,44 @@
           <w:rStyle w:val="NormalTok"/>
         </w:rPr>
         <w:t xml:space="preserve">)</w:t>
+      </w:r>
+    </w:p>
+    <w:p>
+      <w:pPr>
+        <w:pStyle w:val="SourceCode"/>
+      </w:pPr>
+      <w:r>
+        <w:rPr>
+          <w:rStyle w:val="VerbatimChar"/>
+        </w:rPr>
+        <w:t xml:space="preserve">Variación del precio: 10.00%</w:t>
+      </w:r>
+      <w:r>
+        <w:br/>
+      </w:r>
+      <w:r>
+        <w:rPr>
+          <w:rStyle w:val="VerbatimChar"/>
+        </w:rPr>
+        <w:t xml:space="preserve">Variación de la cantidad: -5.00%</w:t>
+      </w:r>
+      <w:r>
+        <w:br/>
+      </w:r>
+      <w:r>
+        <w:rPr>
+          <w:rStyle w:val="VerbatimChar"/>
+        </w:rPr>
+        <w:t xml:space="preserve">Elasticidad precio de la demanda: -0.50</w:t>
+      </w:r>
+      <w:r>
+        <w:br/>
+      </w:r>
+      <w:r>
+        <w:rPr>
+          <w:rStyle w:val="VerbatimChar"/>
+        </w:rPr>
+        <w:t xml:space="preserve">La demanda es inelástica</w:t>
       </w:r>
     </w:p>
     <w:bookmarkEnd w:id="50"/>
@@ -9134,6 +10194,44 @@
         <w:t xml:space="preserve"># 50 (mismo resultado pero más claro)</w:t>
       </w:r>
     </w:p>
+    <w:p>
+      <w:pPr>
+        <w:pStyle w:val="SourceCode"/>
+      </w:pPr>
+      <w:r>
+        <w:rPr>
+          <w:rStyle w:val="VerbatimChar"/>
+        </w:rPr>
+        <w:t xml:space="preserve">14</w:t>
+      </w:r>
+      <w:r>
+        <w:br/>
+      </w:r>
+      <w:r>
+        <w:rPr>
+          <w:rStyle w:val="VerbatimChar"/>
+        </w:rPr>
+        <w:t xml:space="preserve">20</w:t>
+      </w:r>
+      <w:r>
+        <w:br/>
+      </w:r>
+      <w:r>
+        <w:rPr>
+          <w:rStyle w:val="VerbatimChar"/>
+        </w:rPr>
+        <w:t xml:space="preserve">50</w:t>
+      </w:r>
+      <w:r>
+        <w:br/>
+      </w:r>
+      <w:r>
+        <w:rPr>
+          <w:rStyle w:val="VerbatimChar"/>
+        </w:rPr>
+        <w:t xml:space="preserve">50</w:t>
+      </w:r>
+    </w:p>
     <w:bookmarkEnd w:id="53"/>
     <w:bookmarkStart w:id="54" w:name="X5112952764fc43043c568df731a8f8b21159dbc"/>
     <w:p>
@@ -9861,6 +10959,35 @@
           <w:rStyle w:val="NormalTok"/>
         </w:rPr>
         <w:t xml:space="preserve">)</w:t>
+      </w:r>
+    </w:p>
+    <w:p>
+      <w:pPr>
+        <w:pStyle w:val="SourceCode"/>
+      </w:pPr>
+      <w:r>
+        <w:rPr>
+          <w:rStyle w:val="VerbatimChar"/>
+        </w:rPr>
+        <w:t xml:space="preserve">Inversión inicial: S/ 100,000.00</w:t>
+      </w:r>
+      <w:r>
+        <w:br/>
+      </w:r>
+      <w:r>
+        <w:rPr>
+          <w:rStyle w:val="VerbatimChar"/>
+        </w:rPr>
+        <w:t xml:space="preserve">VPN del proyecto: S/ -2,103.68</w:t>
+      </w:r>
+      <w:r>
+        <w:br/>
+      </w:r>
+      <w:r>
+        <w:rPr>
+          <w:rStyle w:val="VerbatimChar"/>
+        </w:rPr>
+        <w:t xml:space="preserve">Decisión: Rechazar el proyecto</w:t>
       </w:r>
     </w:p>
     <w:bookmarkEnd w:id="54"/>
@@ -10250,6 +11377,17 @@
           <w:rStyle w:val="NormalTok"/>
         </w:rPr>
         <w:t xml:space="preserve">)</w:t>
+      </w:r>
+    </w:p>
+    <w:p>
+      <w:pPr>
+        <w:pStyle w:val="SourceCode"/>
+      </w:pPr>
+      <w:r>
+        <w:rPr>
+          <w:rStyle w:val="VerbatimChar"/>
+        </w:rPr>
+        <w:t xml:space="preserve">Tasa efectiva anual: 12.68%</w:t>
       </w:r>
     </w:p>
     <w:bookmarkEnd w:id="55"/>
@@ -10618,6 +11756,26 @@
         <w:t xml:space="preserve">(presentacion)</w:t>
       </w:r>
     </w:p>
+    <w:p>
+      <w:pPr>
+        <w:pStyle w:val="SourceCode"/>
+      </w:pPr>
+      <w:r>
+        <w:rPr>
+          <w:rStyle w:val="VerbatimChar"/>
+        </w:rPr>
+        <w:t xml:space="preserve">Perú está ubicado en América del Sur</w:t>
+      </w:r>
+      <w:r>
+        <w:br/>
+      </w:r>
+      <w:r>
+        <w:rPr>
+          <w:rStyle w:val="VerbatimChar"/>
+        </w:rPr>
+        <w:t xml:space="preserve">Edison Achalma, Economista</w:t>
+      </w:r>
+    </w:p>
     <w:bookmarkEnd w:id="57"/>
     <w:bookmarkStart w:id="58" w:name="repetición-de-strings"/>
     <w:p>
@@ -10856,6 +12014,44 @@
           <w:rStyle w:val="NormalTok"/>
         </w:rPr>
         <w:t xml:space="preserve">)</w:t>
+      </w:r>
+    </w:p>
+    <w:p>
+      <w:pPr>
+        <w:pStyle w:val="SourceCode"/>
+      </w:pPr>
+      <w:r>
+        <w:rPr>
+          <w:rStyle w:val="VerbatimChar"/>
+        </w:rPr>
+        <w:t xml:space="preserve">--------------------------------------------------</w:t>
+      </w:r>
+      <w:r>
+        <w:br/>
+      </w:r>
+      <w:r>
+        <w:rPr>
+          <w:rStyle w:val="VerbatimChar"/>
+        </w:rPr>
+        <w:t xml:space="preserve">========================================</w:t>
+      </w:r>
+      <w:r>
+        <w:br/>
+      </w:r>
+      <w:r>
+        <w:rPr>
+          <w:rStyle w:val="VerbatimChar"/>
+        </w:rPr>
+        <w:t xml:space="preserve">           REPORTE ECONÓMICO            </w:t>
+      </w:r>
+      <w:r>
+        <w:br/>
+      </w:r>
+      <w:r>
+        <w:rPr>
+          <w:rStyle w:val="VerbatimChar"/>
+        </w:rPr>
+        <w:t xml:space="preserve">========================================</w:t>
       </w:r>
     </w:p>
     <w:bookmarkEnd w:id="58"/>
@@ -11237,6 +12433,35 @@
     </w:p>
     <w:p>
       <w:pPr>
+        <w:pStyle w:val="SourceCode"/>
+      </w:pPr>
+      <w:r>
+        <w:rPr>
+          <w:rStyle w:val="VerbatimChar"/>
+        </w:rPr>
+        <w:t xml:space="preserve">El PIB de Perú es USD 242632 millones</w:t>
+      </w:r>
+      <w:r>
+        <w:br/>
+      </w:r>
+      <w:r>
+        <w:rPr>
+          <w:rStyle w:val="VerbatimChar"/>
+        </w:rPr>
+        <w:t xml:space="preserve">La inflación es 3.25%</w:t>
+      </w:r>
+      <w:r>
+        <w:br/>
+      </w:r>
+      <w:r>
+        <w:rPr>
+          <w:rStyle w:val="VerbatimChar"/>
+        </w:rPr>
+        <w:t xml:space="preserve">Edison tiene 30 años</w:t>
+      </w:r>
+    </w:p>
+    <w:p>
+      <w:pPr>
         <w:pStyle w:val="FirstParagraph"/>
       </w:pPr>
       <w:r>
@@ -11755,6 +12980,53 @@
     </w:p>
     <w:p>
       <w:pPr>
+        <w:pStyle w:val="SourceCode"/>
+      </w:pPr>
+      <w:r>
+        <w:rPr>
+          <w:rStyle w:val="VerbatimChar"/>
+        </w:rPr>
+        <w:t xml:space="preserve">El PIB de Perú es USD 242632 millones</w:t>
+      </w:r>
+      <w:r>
+        <w:br/>
+      </w:r>
+      <w:r>
+        <w:rPr>
+          <w:rStyle w:val="VerbatimChar"/>
+        </w:rPr>
+        <w:t xml:space="preserve">El PIB de Perú es USD 242632 millones. Perú es un país emergente.</w:t>
+      </w:r>
+      <w:r>
+        <w:br/>
+      </w:r>
+      <w:r>
+        <w:rPr>
+          <w:rStyle w:val="VerbatimChar"/>
+        </w:rPr>
+        <w:t xml:space="preserve">El PIB de Perú es USD 242632 millones</w:t>
+      </w:r>
+      <w:r>
+        <w:br/>
+      </w:r>
+      <w:r>
+        <w:rPr>
+          <w:rStyle w:val="VerbatimChar"/>
+        </w:rPr>
+        <w:t xml:space="preserve">Inflación: 3.25%</w:t>
+      </w:r>
+      <w:r>
+        <w:br/>
+      </w:r>
+      <w:r>
+        <w:rPr>
+          <w:rStyle w:val="VerbatimChar"/>
+        </w:rPr>
+        <w:t xml:space="preserve">PIB: USD 242,632,000,000</w:t>
+      </w:r>
+    </w:p>
+    <w:p>
+      <w:pPr>
         <w:pStyle w:val="FirstParagraph"/>
       </w:pPr>
       <w:r>
@@ -12338,6 +13610,53 @@
           <w:rStyle w:val="NormalTok"/>
         </w:rPr>
         <w:t xml:space="preserve">)</w:t>
+      </w:r>
+    </w:p>
+    <w:p>
+      <w:pPr>
+        <w:pStyle w:val="SourceCode"/>
+      </w:pPr>
+      <w:r>
+        <w:rPr>
+          <w:rStyle w:val="VerbatimChar"/>
+        </w:rPr>
+        <w:t xml:space="preserve">El PIB de Perú es USD 242632 millones</w:t>
+      </w:r>
+      <w:r>
+        <w:br/>
+      </w:r>
+      <w:r>
+        <w:rPr>
+          <w:rStyle w:val="VerbatimChar"/>
+        </w:rPr>
+        <w:t xml:space="preserve">PIB per cápita: USD 7196.46</w:t>
+      </w:r>
+      <w:r>
+        <w:br/>
+      </w:r>
+      <w:r>
+        <w:rPr>
+          <w:rStyle w:val="VerbatimChar"/>
+        </w:rPr>
+        <w:t xml:space="preserve">Inflación: 3.25%</w:t>
+      </w:r>
+      <w:r>
+        <w:br/>
+      </w:r>
+      <w:r>
+        <w:rPr>
+          <w:rStyle w:val="VerbatimChar"/>
+        </w:rPr>
+        <w:t xml:space="preserve">Población: 33,715,471 habitantes</w:t>
+      </w:r>
+      <w:r>
+        <w:br/>
+      </w:r>
+      <w:r>
+        <w:rPr>
+          <w:rStyle w:val="VerbatimChar"/>
+        </w:rPr>
+        <w:t xml:space="preserve">Valor total: S/ 5,000.00</w:t>
       </w:r>
     </w:p>
     <w:bookmarkEnd w:id="59"/>
@@ -12985,6 +14304,80 @@
         <w:t xml:space="preserve"># 'PIB'</w:t>
       </w:r>
     </w:p>
+    <w:p>
+      <w:pPr>
+        <w:pStyle w:val="SourceCode"/>
+      </w:pPr>
+      <w:r>
+        <w:rPr>
+          <w:rStyle w:val="VerbatimChar"/>
+        </w:rPr>
+        <w:t xml:space="preserve">AGRICULTURA, GANADERÍA Y PESCA</w:t>
+      </w:r>
+      <w:r>
+        <w:br/>
+      </w:r>
+      <w:r>
+        <w:rPr>
+          <w:rStyle w:val="VerbatimChar"/>
+        </w:rPr>
+        <w:t xml:space="preserve">producto bruto interno</w:t>
+      </w:r>
+      <w:r>
+        <w:br/>
+      </w:r>
+      <w:r>
+        <w:rPr>
+          <w:rStyle w:val="VerbatimChar"/>
+        </w:rPr>
+        <w:t xml:space="preserve">Agricultura, Ganadería Y Pesca</w:t>
+      </w:r>
+      <w:r>
+        <w:br/>
+      </w:r>
+      <w:r>
+        <w:rPr>
+          <w:rStyle w:val="VerbatimChar"/>
+        </w:rPr>
+        <w:t xml:space="preserve">Agricultura, ganadería y pesca</w:t>
+      </w:r>
+      <w:r>
+        <w:br/>
+      </w:r>
+      <w:r>
+        <w:rPr>
+          <w:rStyle w:val="VerbatimChar"/>
+        </w:rPr>
+        <w:t xml:space="preserve">La tasa de interés es 6%</w:t>
+      </w:r>
+      <w:r>
+        <w:br/>
+      </w:r>
+      <w:r>
+        <w:rPr>
+          <w:rStyle w:val="VerbatimChar"/>
+        </w:rPr>
+        <w:t xml:space="preserve">['Minería', 'Agricultura', 'Manufactura', 'Servicios']</w:t>
+      </w:r>
+      <w:r>
+        <w:br/>
+      </w:r>
+      <w:r>
+        <w:rPr>
+          <w:rStyle w:val="VerbatimChar"/>
+        </w:rPr>
+        <w:t xml:space="preserve">Producto Bruto Interno</w:t>
+      </w:r>
+      <w:r>
+        <w:br/>
+      </w:r>
+      <w:r>
+        <w:rPr>
+          <w:rStyle w:val="VerbatimChar"/>
+        </w:rPr>
+        <w:t xml:space="preserve">'PIB'</w:t>
+      </w:r>
+    </w:p>
     <w:bookmarkEnd w:id="60"/>
     <w:bookmarkStart w:id="61" w:name="indexación-y-slicing-de-strings"/>
     <w:p>
@@ -13468,6 +14861,107 @@
           <w:rStyle w:val="CommentTok"/>
         </w:rPr>
         <w:t xml:space="preserve"># ONRETNI OTURB OTCUDORP (invertido)</w:t>
+      </w:r>
+    </w:p>
+    <w:p>
+      <w:pPr>
+        <w:pStyle w:val="SourceCode"/>
+      </w:pPr>
+      <w:r>
+        <w:rPr>
+          <w:rStyle w:val="VerbatimChar"/>
+        </w:rPr>
+        <w:t xml:space="preserve">P</w:t>
+      </w:r>
+      <w:r>
+        <w:br/>
+      </w:r>
+      <w:r>
+        <w:rPr>
+          <w:rStyle w:val="VerbatimChar"/>
+        </w:rPr>
+        <w:t xml:space="preserve">R</w:t>
+      </w:r>
+      <w:r>
+        <w:br/>
+      </w:r>
+      <w:r>
+        <w:rPr>
+          <w:rStyle w:val="VerbatimChar"/>
+        </w:rPr>
+        <w:t xml:space="preserve">O</w:t>
+      </w:r>
+      <w:r>
+        <w:br/>
+      </w:r>
+      <w:r>
+        <w:rPr>
+          <w:rStyle w:val="VerbatimChar"/>
+        </w:rPr>
+        <w:t xml:space="preserve">N</w:t>
+      </w:r>
+      <w:r>
+        <w:br/>
+      </w:r>
+      <w:r>
+        <w:rPr>
+          <w:rStyle w:val="VerbatimChar"/>
+        </w:rPr>
+        <w:t xml:space="preserve">PRODUCTO</w:t>
+      </w:r>
+      <w:r>
+        <w:br/>
+      </w:r>
+      <w:r>
+        <w:rPr>
+          <w:rStyle w:val="VerbatimChar"/>
+        </w:rPr>
+        <w:t xml:space="preserve">PRODUCTO</w:t>
+      </w:r>
+      <w:r>
+        <w:br/>
+      </w:r>
+      <w:r>
+        <w:rPr>
+          <w:rStyle w:val="VerbatimChar"/>
+        </w:rPr>
+        <w:t xml:space="preserve">BRUTO</w:t>
+      </w:r>
+      <w:r>
+        <w:br/>
+      </w:r>
+      <w:r>
+        <w:rPr>
+          <w:rStyle w:val="VerbatimChar"/>
+        </w:rPr>
+        <w:t xml:space="preserve">INTERNO</w:t>
+      </w:r>
+      <w:r>
+        <w:br/>
+      </w:r>
+      <w:r>
+        <w:rPr>
+          <w:rStyle w:val="VerbatimChar"/>
+        </w:rPr>
+        <w:t xml:space="preserve">PRODUCTO BRUTO INTERNO</w:t>
+      </w:r>
+      <w:r>
+        <w:br/>
+      </w:r>
+      <w:r>
+        <w:rPr>
+          <w:rStyle w:val="VerbatimChar"/>
+        </w:rPr>
+        <w:t xml:space="preserve">POUT RT NEN</w:t>
+      </w:r>
+      <w:r>
+        <w:br/>
+      </w:r>
+      <w:r>
+        <w:rPr>
+          <w:rStyle w:val="VerbatimChar"/>
+        </w:rPr>
+        <w:t xml:space="preserve">ONRETNI OTURB OTCUDORP</w:t>
       </w:r>
     </w:p>
     <w:bookmarkEnd w:id="61"/>
@@ -13974,6 +15468,89 @@
         <w:t xml:space="preserve"># True</w:t>
       </w:r>
     </w:p>
+    <w:p>
+      <w:pPr>
+        <w:pStyle w:val="SourceCode"/>
+      </w:pPr>
+      <w:r>
+        <w:rPr>
+          <w:rStyle w:val="VerbatimChar"/>
+        </w:rPr>
+        <w:t xml:space="preserve">True</w:t>
+      </w:r>
+      <w:r>
+        <w:br/>
+      </w:r>
+      <w:r>
+        <w:rPr>
+          <w:rStyle w:val="VerbatimChar"/>
+        </w:rPr>
+        <w:t xml:space="preserve">False</w:t>
+      </w:r>
+      <w:r>
+        <w:br/>
+      </w:r>
+      <w:r>
+        <w:rPr>
+          <w:rStyle w:val="VerbatimChar"/>
+        </w:rPr>
+        <w:t xml:space="preserve">True</w:t>
+      </w:r>
+      <w:r>
+        <w:br/>
+      </w:r>
+      <w:r>
+        <w:rPr>
+          <w:rStyle w:val="VerbatimChar"/>
+        </w:rPr>
+        <w:t xml:space="preserve">True</w:t>
+      </w:r>
+      <w:r>
+        <w:br/>
+      </w:r>
+      <w:r>
+        <w:rPr>
+          <w:rStyle w:val="VerbatimChar"/>
+        </w:rPr>
+        <w:t xml:space="preserve">True</w:t>
+      </w:r>
+      <w:r>
+        <w:br/>
+      </w:r>
+      <w:r>
+        <w:rPr>
+          <w:rStyle w:val="VerbatimChar"/>
+        </w:rPr>
+        <w:t xml:space="preserve">False</w:t>
+      </w:r>
+      <w:r>
+        <w:br/>
+      </w:r>
+      <w:r>
+        <w:rPr>
+          <w:rStyle w:val="VerbatimChar"/>
+        </w:rPr>
+        <w:t xml:space="preserve">True</w:t>
+      </w:r>
+      <w:r>
+        <w:br/>
+      </w:r>
+      <w:r>
+        <w:rPr>
+          <w:rStyle w:val="VerbatimChar"/>
+        </w:rPr>
+        <w:t xml:space="preserve">False</w:t>
+      </w:r>
+      <w:r>
+        <w:br/>
+      </w:r>
+      <w:r>
+        <w:rPr>
+          <w:rStyle w:val="VerbatimChar"/>
+        </w:rPr>
+        <w:t xml:space="preserve">True</w:t>
+      </w:r>
+    </w:p>
     <w:bookmarkEnd w:id="62"/>
     <w:bookmarkStart w:id="63" w:name="X587469ed99e523ea4fe71a5048548dc04104739"/>
     <w:p>
@@ -14788,6 +16365,80 @@
           <w:rStyle w:val="NormalTok"/>
         </w:rPr>
         <w:t xml:space="preserve">)</w:t>
+      </w:r>
+    </w:p>
+    <w:p>
+      <w:pPr>
+        <w:pStyle w:val="SourceCode"/>
+      </w:pPr>
+      <w:r>
+        <w:rPr>
+          <w:rStyle w:val="VerbatimChar"/>
+        </w:rPr>
+        <w:t xml:space="preserve">CONTRIBUCIÓN SECTORIAL AL PIB</w:t>
+      </w:r>
+      <w:r>
+        <w:br/>
+      </w:r>
+      <w:r>
+        <w:rPr>
+          <w:rStyle w:val="VerbatimChar"/>
+        </w:rPr>
+        <w:t xml:space="preserve">========================================</w:t>
+      </w:r>
+      <w:r>
+        <w:br/>
+      </w:r>
+      <w:r>
+        <w:rPr>
+          <w:rStyle w:val="VerbatimChar"/>
+        </w:rPr>
+        <w:t xml:space="preserve">Minería           45.2% ██████████████████████</w:t>
+      </w:r>
+      <w:r>
+        <w:br/>
+      </w:r>
+      <w:r>
+        <w:rPr>
+          <w:rStyle w:val="VerbatimChar"/>
+        </w:rPr>
+        <w:t xml:space="preserve">Agricultura       12.8% ██████</w:t>
+      </w:r>
+      <w:r>
+        <w:br/>
+      </w:r>
+      <w:r>
+        <w:rPr>
+          <w:rStyle w:val="VerbatimChar"/>
+        </w:rPr>
+        <w:t xml:space="preserve">Manufactura       23.5% ███████████</w:t>
+      </w:r>
+      <w:r>
+        <w:br/>
+      </w:r>
+      <w:r>
+        <w:rPr>
+          <w:rStyle w:val="VerbatimChar"/>
+        </w:rPr>
+        <w:t xml:space="preserve">Servicios         67.9% █████████████████████████████████</w:t>
+      </w:r>
+      <w:r>
+        <w:br/>
+      </w:r>
+      <w:r>
+        <w:rPr>
+          <w:rStyle w:val="VerbatimChar"/>
+        </w:rPr>
+        <w:t xml:space="preserve">========================================</w:t>
+      </w:r>
+      <w:r>
+        <w:br/>
+      </w:r>
+      <w:r>
+        <w:rPr>
+          <w:rStyle w:val="VerbatimChar"/>
+        </w:rPr>
+        <w:t xml:space="preserve">TOTAL            149.4%</w:t>
       </w:r>
     </w:p>
     <w:bookmarkEnd w:id="63"/>
@@ -19160,6 +20811,17 @@
         <w:t xml:space="preserve">)</w:t>
       </w:r>
     </w:p>
+    <w:p>
+      <w:pPr>
+        <w:pStyle w:val="SourceCode"/>
+      </w:pPr>
+      <w:r>
+        <w:rPr>
+          <w:rStyle w:val="VerbatimChar"/>
+        </w:rPr>
+        <w:t xml:space="preserve">Elasticidad: -0.50</w:t>
+      </w:r>
+    </w:p>
     <w:bookmarkEnd w:id="74"/>
     <w:bookmarkEnd w:id="75"/>
     <w:bookmarkStart w:id="80" w:name="nombres-de-variables-mnemotécnicos"/>
@@ -21636,7 +23298,7 @@
         <w:rPr>
           <w:rStyle w:val="NormalTok"/>
         </w:rPr>
-        <w:t xml:space="preserve">    </w:t>
+        <w:t xml:space="preserve">  </w:t>
       </w:r>
       <w:r>
         <w:rPr>
@@ -23172,6 +24834,15 @@
         <w:t xml:space="preserve"> (</w:t>
       </w:r>
       <w:r>
+        <w:br/>
+      </w:r>
+      <w:r>
+        <w:rPr>
+          <w:rStyle w:val="NormalTok"/>
+        </w:rPr>
+        <w:t xml:space="preserve">    (</w:t>
+      </w:r>
+      <w:r>
         <w:rPr>
           <w:rStyle w:val="FloatTok"/>
         </w:rPr>
@@ -23193,7 +24864,16 @@
         <w:rPr>
           <w:rStyle w:val="NormalTok"/>
         </w:rPr>
-        <w:t xml:space="preserve"> prop_1) </w:t>
+        <w:t xml:space="preserve"> prop_1)</w:t>
+      </w:r>
+      <w:r>
+        <w:br/>
+      </w:r>
+      <w:r>
+        <w:rPr>
+          <w:rStyle w:val="NormalTok"/>
+        </w:rPr>
+        <w:t xml:space="preserve">    </w:t>
       </w:r>
       <w:r>
         <w:rPr>
@@ -23205,22 +24885,7 @@
         <w:rPr>
           <w:rStyle w:val="NormalTok"/>
         </w:rPr>
-        <w:t xml:space="preserve"> </w:t>
-      </w:r>
-      <w:r>
-        <w:rPr>
-          <w:rStyle w:val="OperatorTok"/>
-        </w:rPr>
-        <w:t xml:space="preserve">\</w:t>
-      </w:r>
-      <w:r>
-        <w:br/>
-      </w:r>
-      <w:r>
-        <w:rPr>
-          <w:rStyle w:val="NormalTok"/>
-        </w:rPr>
-        <w:t xml:space="preserve">                   (</w:t>
+        <w:t xml:space="preserve"> (</w:t>
       </w:r>
       <w:r>
         <w:rPr>
@@ -23277,10 +24942,13 @@
         <w:t xml:space="preserve">2</w:t>
       </w:r>
       <w:r>
-        <w:rPr>
-          <w:rStyle w:val="NormalTok"/>
-        </w:rPr>
-        <w:t xml:space="preserve"> </w:t>
+        <w:br/>
+      </w:r>
+      <w:r>
+        <w:rPr>
+          <w:rStyle w:val="NormalTok"/>
+        </w:rPr>
+        <w:t xml:space="preserve">    </w:t>
       </w:r>
       <w:r>
         <w:rPr>
@@ -23292,22 +24960,7 @@
         <w:rPr>
           <w:rStyle w:val="NormalTok"/>
         </w:rPr>
-        <w:t xml:space="preserve"> </w:t>
-      </w:r>
-      <w:r>
-        <w:rPr>
-          <w:rStyle w:val="OperatorTok"/>
-        </w:rPr>
-        <w:t xml:space="preserve">\</w:t>
-      </w:r>
-      <w:r>
-        <w:br/>
-      </w:r>
-      <w:r>
-        <w:rPr>
-          <w:rStyle w:val="NormalTok"/>
-        </w:rPr>
-        <w:t xml:space="preserve">                   (</w:t>
+        <w:t xml:space="preserve"> (</w:t>
       </w:r>
       <w:r>
         <w:rPr>
@@ -23364,10 +25017,13 @@
         <w:t xml:space="preserve">2</w:t>
       </w:r>
       <w:r>
-        <w:rPr>
-          <w:rStyle w:val="NormalTok"/>
-        </w:rPr>
-        <w:t xml:space="preserve"> </w:t>
+        <w:br/>
+      </w:r>
+      <w:r>
+        <w:rPr>
+          <w:rStyle w:val="NormalTok"/>
+        </w:rPr>
+        <w:t xml:space="preserve">    </w:t>
       </w:r>
       <w:r>
         <w:rPr>
@@ -23379,22 +25035,7 @@
         <w:rPr>
           <w:rStyle w:val="NormalTok"/>
         </w:rPr>
-        <w:t xml:space="preserve"> </w:t>
-      </w:r>
-      <w:r>
-        <w:rPr>
-          <w:rStyle w:val="OperatorTok"/>
-        </w:rPr>
-        <w:t xml:space="preserve">\</w:t>
-      </w:r>
-      <w:r>
-        <w:br/>
-      </w:r>
-      <w:r>
-        <w:rPr>
-          <w:rStyle w:val="NormalTok"/>
-        </w:rPr>
-        <w:t xml:space="preserve">                   (</w:t>
+        <w:t xml:space="preserve"> (</w:t>
       </w:r>
       <w:r>
         <w:rPr>
@@ -23451,10 +25092,13 @@
         <w:t xml:space="preserve">2</w:t>
       </w:r>
       <w:r>
-        <w:rPr>
-          <w:rStyle w:val="NormalTok"/>
-        </w:rPr>
-        <w:t xml:space="preserve"> </w:t>
+        <w:br/>
+      </w:r>
+      <w:r>
+        <w:rPr>
+          <w:rStyle w:val="NormalTok"/>
+        </w:rPr>
+        <w:t xml:space="preserve">    </w:t>
       </w:r>
       <w:r>
         <w:rPr>
@@ -23466,22 +25110,7 @@
         <w:rPr>
           <w:rStyle w:val="NormalTok"/>
         </w:rPr>
-        <w:t xml:space="preserve"> </w:t>
-      </w:r>
-      <w:r>
-        <w:rPr>
-          <w:rStyle w:val="OperatorTok"/>
-        </w:rPr>
-        <w:t xml:space="preserve">\</w:t>
-      </w:r>
-      <w:r>
-        <w:br/>
-      </w:r>
-      <w:r>
-        <w:rPr>
-          <w:rStyle w:val="NormalTok"/>
-        </w:rPr>
-        <w:t xml:space="preserve">                   (</w:t>
+        <w:t xml:space="preserve"> (</w:t>
       </w:r>
       <w:r>
         <w:rPr>
@@ -23536,6 +25165,15 @@
           <w:rStyle w:val="DecValTok"/>
         </w:rPr>
         <w:t xml:space="preserve">2</w:t>
+      </w:r>
+      <w:r>
+        <w:br/>
+      </w:r>
+      <w:r>
+        <w:rPr>
+          <w:rStyle w:val="NormalTok"/>
+        </w:rPr>
+        <w:t xml:space="preserve">)</w:t>
       </w:r>
       <w:r>
         <w:br/>
@@ -24897,7 +26535,16 @@
         <w:rPr>
           <w:rStyle w:val="NormalTok"/>
         </w:rPr>
-        <w:t xml:space="preserve"> (margen_contribucion_unitario </w:t>
+        <w:t xml:space="preserve"> (</w:t>
+      </w:r>
+      <w:r>
+        <w:br/>
+      </w:r>
+      <w:r>
+        <w:rPr>
+          <w:rStyle w:val="NormalTok"/>
+        </w:rPr>
+        <w:t xml:space="preserve">        margen_contribucion_unitario </w:t>
       </w:r>
       <w:r>
         <w:rPr>
@@ -24909,7 +26556,16 @@
         <w:rPr>
           <w:rStyle w:val="NormalTok"/>
         </w:rPr>
-        <w:t xml:space="preserve"> precio_venta_unitario) </w:t>
+        <w:t xml:space="preserve"> precio_venta_unitario</w:t>
+      </w:r>
+      <w:r>
+        <w:br/>
+      </w:r>
+      <w:r>
+        <w:rPr>
+          <w:rStyle w:val="NormalTok"/>
+        </w:rPr>
+        <w:t xml:space="preserve">    ) </w:t>
       </w:r>
       <w:r>
         <w:rPr>
@@ -24933,19 +26589,892 @@
         <w:br/>
       </w:r>
       <w:r>
+        <w:br/>
+      </w:r>
+      <w:r>
+        <w:rPr>
+          <w:rStyle w:val="NormalTok"/>
+        </w:rPr>
+        <w:t xml:space="preserve">    punto_equilibrio_unidades </w:t>
+      </w:r>
+      <w:r>
+        <w:rPr>
+          <w:rStyle w:val="OperatorTok"/>
+        </w:rPr>
+        <w:t xml:space="preserve">=</w:t>
+      </w:r>
+      <w:r>
+        <w:rPr>
+          <w:rStyle w:val="NormalTok"/>
+        </w:rPr>
+        <w:t xml:space="preserve"> costos_fijos </w:t>
+      </w:r>
+      <w:r>
+        <w:rPr>
+          <w:rStyle w:val="OperatorTok"/>
+        </w:rPr>
+        <w:t xml:space="preserve">/</w:t>
+      </w:r>
+      <w:r>
+        <w:rPr>
+          <w:rStyle w:val="NormalTok"/>
+        </w:rPr>
+        <w:t xml:space="preserve"> margen_contribucion_unitario</w:t>
+      </w:r>
+      <w:r>
+        <w:br/>
+      </w:r>
+      <w:r>
+        <w:rPr>
+          <w:rStyle w:val="NormalTok"/>
+        </w:rPr>
+        <w:t xml:space="preserve">    punto_equilibrio_soles </w:t>
+      </w:r>
+      <w:r>
+        <w:rPr>
+          <w:rStyle w:val="OperatorTok"/>
+        </w:rPr>
+        <w:t xml:space="preserve">=</w:t>
+      </w:r>
+      <w:r>
+        <w:rPr>
+          <w:rStyle w:val="NormalTok"/>
+        </w:rPr>
+        <w:t xml:space="preserve"> punto_equilibrio_unidades </w:t>
+      </w:r>
+      <w:r>
+        <w:rPr>
+          <w:rStyle w:val="OperatorTok"/>
+        </w:rPr>
+        <w:t xml:space="preserve">*</w:t>
+      </w:r>
+      <w:r>
+        <w:rPr>
+          <w:rStyle w:val="NormalTok"/>
+        </w:rPr>
+        <w:t xml:space="preserve"> precio_venta_unitario</w:t>
+      </w:r>
+      <w:r>
+        <w:br/>
+      </w:r>
+      <w:r>
+        <w:br/>
+      </w:r>
+      <w:r>
         <w:rPr>
           <w:rStyle w:val="NormalTok"/>
         </w:rPr>
         <w:t xml:space="preserve">    </w:t>
       </w:r>
       <w:r>
-        <w:br/>
-      </w:r>
-      <w:r>
-        <w:rPr>
-          <w:rStyle w:val="NormalTok"/>
-        </w:rPr>
-        <w:t xml:space="preserve">    punto_equilibrio_unidades </w:t>
+        <w:rPr>
+          <w:rStyle w:val="CommentTok"/>
+        </w:rPr>
+        <w:t xml:space="preserve"># Resultados</w:t>
+      </w:r>
+      <w:r>
+        <w:br/>
+      </w:r>
+      <w:r>
+        <w:rPr>
+          <w:rStyle w:val="NormalTok"/>
+        </w:rPr>
+        <w:t xml:space="preserve">    </w:t>
+      </w:r>
+      <w:r>
+        <w:rPr>
+          <w:rStyle w:val="BuiltInTok"/>
+        </w:rPr>
+        <w:t xml:space="preserve">print</w:t>
+      </w:r>
+      <w:r>
+        <w:rPr>
+          <w:rStyle w:val="NormalTok"/>
+        </w:rPr>
+        <w:t xml:space="preserve">(</w:t>
+      </w:r>
+      <w:r>
+        <w:rPr>
+          <w:rStyle w:val="StringTok"/>
+        </w:rPr>
+        <w:t xml:space="preserve">"</w:t>
+      </w:r>
+      <w:r>
+        <w:rPr>
+          <w:rStyle w:val="CharTok"/>
+        </w:rPr>
+        <w:t xml:space="preserve">\n</w:t>
+      </w:r>
+      <w:r>
+        <w:rPr>
+          <w:rStyle w:val="StringTok"/>
+        </w:rPr>
+        <w:t xml:space="preserve">"</w:t>
+      </w:r>
+      <w:r>
+        <w:rPr>
+          <w:rStyle w:val="NormalTok"/>
+        </w:rPr>
+        <w:t xml:space="preserve"> </w:t>
+      </w:r>
+      <w:r>
+        <w:rPr>
+          <w:rStyle w:val="OperatorTok"/>
+        </w:rPr>
+        <w:t xml:space="preserve">+</w:t>
+      </w:r>
+      <w:r>
+        <w:rPr>
+          <w:rStyle w:val="NormalTok"/>
+        </w:rPr>
+        <w:t xml:space="preserve"> </w:t>
+      </w:r>
+      <w:r>
+        <w:rPr>
+          <w:rStyle w:val="StringTok"/>
+        </w:rPr>
+        <w:t xml:space="preserve">"="</w:t>
+      </w:r>
+      <w:r>
+        <w:rPr>
+          <w:rStyle w:val="NormalTok"/>
+        </w:rPr>
+        <w:t xml:space="preserve"> </w:t>
+      </w:r>
+      <w:r>
+        <w:rPr>
+          <w:rStyle w:val="OperatorTok"/>
+        </w:rPr>
+        <w:t xml:space="preserve">*</w:t>
+      </w:r>
+      <w:r>
+        <w:rPr>
+          <w:rStyle w:val="NormalTok"/>
+        </w:rPr>
+        <w:t xml:space="preserve"> </w:t>
+      </w:r>
+      <w:r>
+        <w:rPr>
+          <w:rStyle w:val="DecValTok"/>
+        </w:rPr>
+        <w:t xml:space="preserve">50</w:t>
+      </w:r>
+      <w:r>
+        <w:rPr>
+          <w:rStyle w:val="NormalTok"/>
+        </w:rPr>
+        <w:t xml:space="preserve">)</w:t>
+      </w:r>
+      <w:r>
+        <w:br/>
+      </w:r>
+      <w:r>
+        <w:rPr>
+          <w:rStyle w:val="NormalTok"/>
+        </w:rPr>
+        <w:t xml:space="preserve">    </w:t>
+      </w:r>
+      <w:r>
+        <w:rPr>
+          <w:rStyle w:val="BuiltInTok"/>
+        </w:rPr>
+        <w:t xml:space="preserve">print</w:t>
+      </w:r>
+      <w:r>
+        <w:rPr>
+          <w:rStyle w:val="NormalTok"/>
+        </w:rPr>
+        <w:t xml:space="preserve">(</w:t>
+      </w:r>
+      <w:r>
+        <w:rPr>
+          <w:rStyle w:val="StringTok"/>
+        </w:rPr>
+        <w:t xml:space="preserve">"RESULTADOS DEL ANÁLISIS"</w:t>
+      </w:r>
+      <w:r>
+        <w:rPr>
+          <w:rStyle w:val="NormalTok"/>
+        </w:rPr>
+        <w:t xml:space="preserve">)</w:t>
+      </w:r>
+      <w:r>
+        <w:br/>
+      </w:r>
+      <w:r>
+        <w:rPr>
+          <w:rStyle w:val="NormalTok"/>
+        </w:rPr>
+        <w:t xml:space="preserve">    </w:t>
+      </w:r>
+      <w:r>
+        <w:rPr>
+          <w:rStyle w:val="BuiltInTok"/>
+        </w:rPr>
+        <w:t xml:space="preserve">print</w:t>
+      </w:r>
+      <w:r>
+        <w:rPr>
+          <w:rStyle w:val="NormalTok"/>
+        </w:rPr>
+        <w:t xml:space="preserve">(</w:t>
+      </w:r>
+      <w:r>
+        <w:rPr>
+          <w:rStyle w:val="StringTok"/>
+        </w:rPr>
+        <w:t xml:space="preserve">"="</w:t>
+      </w:r>
+      <w:r>
+        <w:rPr>
+          <w:rStyle w:val="NormalTok"/>
+        </w:rPr>
+        <w:t xml:space="preserve"> </w:t>
+      </w:r>
+      <w:r>
+        <w:rPr>
+          <w:rStyle w:val="OperatorTok"/>
+        </w:rPr>
+        <w:t xml:space="preserve">*</w:t>
+      </w:r>
+      <w:r>
+        <w:rPr>
+          <w:rStyle w:val="NormalTok"/>
+        </w:rPr>
+        <w:t xml:space="preserve"> </w:t>
+      </w:r>
+      <w:r>
+        <w:rPr>
+          <w:rStyle w:val="DecValTok"/>
+        </w:rPr>
+        <w:t xml:space="preserve">50</w:t>
+      </w:r>
+      <w:r>
+        <w:rPr>
+          <w:rStyle w:val="NormalTok"/>
+        </w:rPr>
+        <w:t xml:space="preserve">)</w:t>
+      </w:r>
+      <w:r>
+        <w:br/>
+      </w:r>
+      <w:r>
+        <w:rPr>
+          <w:rStyle w:val="NormalTok"/>
+        </w:rPr>
+        <w:t xml:space="preserve">    </w:t>
+      </w:r>
+      <w:r>
+        <w:rPr>
+          <w:rStyle w:val="BuiltInTok"/>
+        </w:rPr>
+        <w:t xml:space="preserve">print</w:t>
+      </w:r>
+      <w:r>
+        <w:rPr>
+          <w:rStyle w:val="NormalTok"/>
+        </w:rPr>
+        <w:t xml:space="preserve">(</w:t>
+      </w:r>
+      <w:r>
+        <w:rPr>
+          <w:rStyle w:val="SpecialStringTok"/>
+        </w:rPr>
+        <w:t xml:space="preserve">f"Costos fijos:                 S/ </w:t>
+      </w:r>
+      <w:r>
+        <w:rPr>
+          <w:rStyle w:val="SpecialCharTok"/>
+        </w:rPr>
+        <w:t xml:space="preserve">{</w:t>
+      </w:r>
+      <w:r>
+        <w:rPr>
+          <w:rStyle w:val="NormalTok"/>
+        </w:rPr>
+        <w:t xml:space="preserve">costos_fijos</w:t>
+      </w:r>
+      <w:r>
+        <w:rPr>
+          <w:rStyle w:val="SpecialCharTok"/>
+        </w:rPr>
+        <w:t xml:space="preserve">:,.2f}</w:t>
+      </w:r>
+      <w:r>
+        <w:rPr>
+          <w:rStyle w:val="SpecialStringTok"/>
+        </w:rPr>
+        <w:t xml:space="preserve">"</w:t>
+      </w:r>
+      <w:r>
+        <w:rPr>
+          <w:rStyle w:val="NormalTok"/>
+        </w:rPr>
+        <w:t xml:space="preserve">)</w:t>
+      </w:r>
+      <w:r>
+        <w:br/>
+      </w:r>
+      <w:r>
+        <w:rPr>
+          <w:rStyle w:val="NormalTok"/>
+        </w:rPr>
+        <w:t xml:space="preserve">    </w:t>
+      </w:r>
+      <w:r>
+        <w:rPr>
+          <w:rStyle w:val="BuiltInTok"/>
+        </w:rPr>
+        <w:t xml:space="preserve">print</w:t>
+      </w:r>
+      <w:r>
+        <w:rPr>
+          <w:rStyle w:val="NormalTok"/>
+        </w:rPr>
+        <w:t xml:space="preserve">(</w:t>
+      </w:r>
+      <w:r>
+        <w:rPr>
+          <w:rStyle w:val="SpecialStringTok"/>
+        </w:rPr>
+        <w:t xml:space="preserve">f"Costo variable unitario:      S/ </w:t>
+      </w:r>
+      <w:r>
+        <w:rPr>
+          <w:rStyle w:val="SpecialCharTok"/>
+        </w:rPr>
+        <w:t xml:space="preserve">{</w:t>
+      </w:r>
+      <w:r>
+        <w:rPr>
+          <w:rStyle w:val="NormalTok"/>
+        </w:rPr>
+        <w:t xml:space="preserve">costo_variable_unitario</w:t>
+      </w:r>
+      <w:r>
+        <w:rPr>
+          <w:rStyle w:val="SpecialCharTok"/>
+        </w:rPr>
+        <w:t xml:space="preserve">:,.2f}</w:t>
+      </w:r>
+      <w:r>
+        <w:rPr>
+          <w:rStyle w:val="SpecialStringTok"/>
+        </w:rPr>
+        <w:t xml:space="preserve">"</w:t>
+      </w:r>
+      <w:r>
+        <w:rPr>
+          <w:rStyle w:val="NormalTok"/>
+        </w:rPr>
+        <w:t xml:space="preserve">)</w:t>
+      </w:r>
+      <w:r>
+        <w:br/>
+      </w:r>
+      <w:r>
+        <w:rPr>
+          <w:rStyle w:val="NormalTok"/>
+        </w:rPr>
+        <w:t xml:space="preserve">    </w:t>
+      </w:r>
+      <w:r>
+        <w:rPr>
+          <w:rStyle w:val="BuiltInTok"/>
+        </w:rPr>
+        <w:t xml:space="preserve">print</w:t>
+      </w:r>
+      <w:r>
+        <w:rPr>
+          <w:rStyle w:val="NormalTok"/>
+        </w:rPr>
+        <w:t xml:space="preserve">(</w:t>
+      </w:r>
+      <w:r>
+        <w:rPr>
+          <w:rStyle w:val="SpecialStringTok"/>
+        </w:rPr>
+        <w:t xml:space="preserve">f"Precio de venta unitario:     S/ </w:t>
+      </w:r>
+      <w:r>
+        <w:rPr>
+          <w:rStyle w:val="SpecialCharTok"/>
+        </w:rPr>
+        <w:t xml:space="preserve">{</w:t>
+      </w:r>
+      <w:r>
+        <w:rPr>
+          <w:rStyle w:val="NormalTok"/>
+        </w:rPr>
+        <w:t xml:space="preserve">precio_venta_unitario</w:t>
+      </w:r>
+      <w:r>
+        <w:rPr>
+          <w:rStyle w:val="SpecialCharTok"/>
+        </w:rPr>
+        <w:t xml:space="preserve">:,.2f}</w:t>
+      </w:r>
+      <w:r>
+        <w:rPr>
+          <w:rStyle w:val="SpecialStringTok"/>
+        </w:rPr>
+        <w:t xml:space="preserve">"</w:t>
+      </w:r>
+      <w:r>
+        <w:rPr>
+          <w:rStyle w:val="NormalTok"/>
+        </w:rPr>
+        <w:t xml:space="preserve">)</w:t>
+      </w:r>
+      <w:r>
+        <w:br/>
+      </w:r>
+      <w:r>
+        <w:rPr>
+          <w:rStyle w:val="NormalTok"/>
+        </w:rPr>
+        <w:t xml:space="preserve">    </w:t>
+      </w:r>
+      <w:r>
+        <w:rPr>
+          <w:rStyle w:val="BuiltInTok"/>
+        </w:rPr>
+        <w:t xml:space="preserve">print</w:t>
+      </w:r>
+      <w:r>
+        <w:rPr>
+          <w:rStyle w:val="NormalTok"/>
+        </w:rPr>
+        <w:t xml:space="preserve">(</w:t>
+      </w:r>
+      <w:r>
+        <w:rPr>
+          <w:rStyle w:val="SpecialStringTok"/>
+        </w:rPr>
+        <w:t xml:space="preserve">f"Margen de contribución:       S/ </w:t>
+      </w:r>
+      <w:r>
+        <w:rPr>
+          <w:rStyle w:val="SpecialCharTok"/>
+        </w:rPr>
+        <w:t xml:space="preserve">{</w:t>
+      </w:r>
+      <w:r>
+        <w:rPr>
+          <w:rStyle w:val="NormalTok"/>
+        </w:rPr>
+        <w:t xml:space="preserve">margen_contribucion_unitario</w:t>
+      </w:r>
+      <w:r>
+        <w:rPr>
+          <w:rStyle w:val="SpecialCharTok"/>
+        </w:rPr>
+        <w:t xml:space="preserve">:,.2f}</w:t>
+      </w:r>
+      <w:r>
+        <w:rPr>
+          <w:rStyle w:val="SpecialStringTok"/>
+        </w:rPr>
+        <w:t xml:space="preserve">"</w:t>
+      </w:r>
+      <w:r>
+        <w:rPr>
+          <w:rStyle w:val="NormalTok"/>
+        </w:rPr>
+        <w:t xml:space="preserve">)</w:t>
+      </w:r>
+      <w:r>
+        <w:br/>
+      </w:r>
+      <w:r>
+        <w:rPr>
+          <w:rStyle w:val="NormalTok"/>
+        </w:rPr>
+        <w:t xml:space="preserve">    </w:t>
+      </w:r>
+      <w:r>
+        <w:rPr>
+          <w:rStyle w:val="BuiltInTok"/>
+        </w:rPr>
+        <w:t xml:space="preserve">print</w:t>
+      </w:r>
+      <w:r>
+        <w:rPr>
+          <w:rStyle w:val="NormalTok"/>
+        </w:rPr>
+        <w:t xml:space="preserve">(</w:t>
+      </w:r>
+      <w:r>
+        <w:rPr>
+          <w:rStyle w:val="SpecialStringTok"/>
+        </w:rPr>
+        <w:t xml:space="preserve">f"Margen de contribución:       </w:t>
+      </w:r>
+      <w:r>
+        <w:rPr>
+          <w:rStyle w:val="SpecialCharTok"/>
+        </w:rPr>
+        <w:t xml:space="preserve">{</w:t>
+      </w:r>
+      <w:r>
+        <w:rPr>
+          <w:rStyle w:val="NormalTok"/>
+        </w:rPr>
+        <w:t xml:space="preserve">margen_contribucion_porcentaje</w:t>
+      </w:r>
+      <w:r>
+        <w:rPr>
+          <w:rStyle w:val="SpecialCharTok"/>
+        </w:rPr>
+        <w:t xml:space="preserve">:.1f}</w:t>
+      </w:r>
+      <w:r>
+        <w:rPr>
+          <w:rStyle w:val="SpecialStringTok"/>
+        </w:rPr>
+        <w:t xml:space="preserve">%"</w:t>
+      </w:r>
+      <w:r>
+        <w:rPr>
+          <w:rStyle w:val="NormalTok"/>
+        </w:rPr>
+        <w:t xml:space="preserve">)</w:t>
+      </w:r>
+      <w:r>
+        <w:br/>
+      </w:r>
+      <w:r>
+        <w:rPr>
+          <w:rStyle w:val="NormalTok"/>
+        </w:rPr>
+        <w:t xml:space="preserve">    </w:t>
+      </w:r>
+      <w:r>
+        <w:rPr>
+          <w:rStyle w:val="BuiltInTok"/>
+        </w:rPr>
+        <w:t xml:space="preserve">print</w:t>
+      </w:r>
+      <w:r>
+        <w:rPr>
+          <w:rStyle w:val="NormalTok"/>
+        </w:rPr>
+        <w:t xml:space="preserve">(</w:t>
+      </w:r>
+      <w:r>
+        <w:rPr>
+          <w:rStyle w:val="StringTok"/>
+        </w:rPr>
+        <w:t xml:space="preserve">"</w:t>
+      </w:r>
+      <w:r>
+        <w:rPr>
+          <w:rStyle w:val="CharTok"/>
+        </w:rPr>
+        <w:t xml:space="preserve">\n</w:t>
+      </w:r>
+      <w:r>
+        <w:rPr>
+          <w:rStyle w:val="StringTok"/>
+        </w:rPr>
+        <w:t xml:space="preserve">"</w:t>
+      </w:r>
+      <w:r>
+        <w:rPr>
+          <w:rStyle w:val="NormalTok"/>
+        </w:rPr>
+        <w:t xml:space="preserve"> </w:t>
+      </w:r>
+      <w:r>
+        <w:rPr>
+          <w:rStyle w:val="OperatorTok"/>
+        </w:rPr>
+        <w:t xml:space="preserve">+</w:t>
+      </w:r>
+      <w:r>
+        <w:rPr>
+          <w:rStyle w:val="NormalTok"/>
+        </w:rPr>
+        <w:t xml:space="preserve"> </w:t>
+      </w:r>
+      <w:r>
+        <w:rPr>
+          <w:rStyle w:val="StringTok"/>
+        </w:rPr>
+        <w:t xml:space="preserve">"-"</w:t>
+      </w:r>
+      <w:r>
+        <w:rPr>
+          <w:rStyle w:val="NormalTok"/>
+        </w:rPr>
+        <w:t xml:space="preserve"> </w:t>
+      </w:r>
+      <w:r>
+        <w:rPr>
+          <w:rStyle w:val="OperatorTok"/>
+        </w:rPr>
+        <w:t xml:space="preserve">*</w:t>
+      </w:r>
+      <w:r>
+        <w:rPr>
+          <w:rStyle w:val="NormalTok"/>
+        </w:rPr>
+        <w:t xml:space="preserve"> </w:t>
+      </w:r>
+      <w:r>
+        <w:rPr>
+          <w:rStyle w:val="DecValTok"/>
+        </w:rPr>
+        <w:t xml:space="preserve">50</w:t>
+      </w:r>
+      <w:r>
+        <w:rPr>
+          <w:rStyle w:val="NormalTok"/>
+        </w:rPr>
+        <w:t xml:space="preserve">)</w:t>
+      </w:r>
+      <w:r>
+        <w:br/>
+      </w:r>
+      <w:r>
+        <w:rPr>
+          <w:rStyle w:val="NormalTok"/>
+        </w:rPr>
+        <w:t xml:space="preserve">    </w:t>
+      </w:r>
+      <w:r>
+        <w:rPr>
+          <w:rStyle w:val="BuiltInTok"/>
+        </w:rPr>
+        <w:t xml:space="preserve">print</w:t>
+      </w:r>
+      <w:r>
+        <w:rPr>
+          <w:rStyle w:val="NormalTok"/>
+        </w:rPr>
+        <w:t xml:space="preserve">(</w:t>
+      </w:r>
+      <w:r>
+        <w:rPr>
+          <w:rStyle w:val="SpecialStringTok"/>
+        </w:rPr>
+        <w:t xml:space="preserve">f"Punto de equilibrio:          </w:t>
+      </w:r>
+      <w:r>
+        <w:rPr>
+          <w:rStyle w:val="SpecialCharTok"/>
+        </w:rPr>
+        <w:t xml:space="preserve">{</w:t>
+      </w:r>
+      <w:r>
+        <w:rPr>
+          <w:rStyle w:val="NormalTok"/>
+        </w:rPr>
+        <w:t xml:space="preserve">punto_equilibrio_unidades</w:t>
+      </w:r>
+      <w:r>
+        <w:rPr>
+          <w:rStyle w:val="SpecialCharTok"/>
+        </w:rPr>
+        <w:t xml:space="preserve">:.0f}</w:t>
+      </w:r>
+      <w:r>
+        <w:rPr>
+          <w:rStyle w:val="SpecialStringTok"/>
+        </w:rPr>
+        <w:t xml:space="preserve"> unidades"</w:t>
+      </w:r>
+      <w:r>
+        <w:rPr>
+          <w:rStyle w:val="NormalTok"/>
+        </w:rPr>
+        <w:t xml:space="preserve">)</w:t>
+      </w:r>
+      <w:r>
+        <w:br/>
+      </w:r>
+      <w:r>
+        <w:rPr>
+          <w:rStyle w:val="NormalTok"/>
+        </w:rPr>
+        <w:t xml:space="preserve">    </w:t>
+      </w:r>
+      <w:r>
+        <w:rPr>
+          <w:rStyle w:val="BuiltInTok"/>
+        </w:rPr>
+        <w:t xml:space="preserve">print</w:t>
+      </w:r>
+      <w:r>
+        <w:rPr>
+          <w:rStyle w:val="NormalTok"/>
+        </w:rPr>
+        <w:t xml:space="preserve">(</w:t>
+      </w:r>
+      <w:r>
+        <w:rPr>
+          <w:rStyle w:val="SpecialStringTok"/>
+        </w:rPr>
+        <w:t xml:space="preserve">f"Punto de equilibrio:          S/ </w:t>
+      </w:r>
+      <w:r>
+        <w:rPr>
+          <w:rStyle w:val="SpecialCharTok"/>
+        </w:rPr>
+        <w:t xml:space="preserve">{</w:t>
+      </w:r>
+      <w:r>
+        <w:rPr>
+          <w:rStyle w:val="NormalTok"/>
+        </w:rPr>
+        <w:t xml:space="preserve">punto_equilibrio_soles</w:t>
+      </w:r>
+      <w:r>
+        <w:rPr>
+          <w:rStyle w:val="SpecialCharTok"/>
+        </w:rPr>
+        <w:t xml:space="preserve">:,.2f}</w:t>
+      </w:r>
+      <w:r>
+        <w:rPr>
+          <w:rStyle w:val="SpecialStringTok"/>
+        </w:rPr>
+        <w:t xml:space="preserve">"</w:t>
+      </w:r>
+      <w:r>
+        <w:rPr>
+          <w:rStyle w:val="NormalTok"/>
+        </w:rPr>
+        <w:t xml:space="preserve">)</w:t>
+      </w:r>
+      <w:r>
+        <w:br/>
+      </w:r>
+      <w:r>
+        <w:rPr>
+          <w:rStyle w:val="NormalTok"/>
+        </w:rPr>
+        <w:t xml:space="preserve">    </w:t>
+      </w:r>
+      <w:r>
+        <w:rPr>
+          <w:rStyle w:val="BuiltInTok"/>
+        </w:rPr>
+        <w:t xml:space="preserve">print</w:t>
+      </w:r>
+      <w:r>
+        <w:rPr>
+          <w:rStyle w:val="NormalTok"/>
+        </w:rPr>
+        <w:t xml:space="preserve">(</w:t>
+      </w:r>
+      <w:r>
+        <w:rPr>
+          <w:rStyle w:val="StringTok"/>
+        </w:rPr>
+        <w:t xml:space="preserve">"="</w:t>
+      </w:r>
+      <w:r>
+        <w:rPr>
+          <w:rStyle w:val="NormalTok"/>
+        </w:rPr>
+        <w:t xml:space="preserve"> </w:t>
+      </w:r>
+      <w:r>
+        <w:rPr>
+          <w:rStyle w:val="OperatorTok"/>
+        </w:rPr>
+        <w:t xml:space="preserve">*</w:t>
+      </w:r>
+      <w:r>
+        <w:rPr>
+          <w:rStyle w:val="NormalTok"/>
+        </w:rPr>
+        <w:t xml:space="preserve"> </w:t>
+      </w:r>
+      <w:r>
+        <w:rPr>
+          <w:rStyle w:val="DecValTok"/>
+        </w:rPr>
+        <w:t xml:space="preserve">50</w:t>
+      </w:r>
+      <w:r>
+        <w:rPr>
+          <w:rStyle w:val="NormalTok"/>
+        </w:rPr>
+        <w:t xml:space="preserve">)</w:t>
+      </w:r>
+      <w:r>
+        <w:br/>
+      </w:r>
+      <w:r>
+        <w:br/>
+      </w:r>
+      <w:r>
+        <w:rPr>
+          <w:rStyle w:val="NormalTok"/>
+        </w:rPr>
+        <w:t xml:space="preserve">    </w:t>
+      </w:r>
+      <w:r>
+        <w:rPr>
+          <w:rStyle w:val="CommentTok"/>
+        </w:rPr>
+        <w:t xml:space="preserve"># Análisis adicional</w:t>
+      </w:r>
+      <w:r>
+        <w:br/>
+      </w:r>
+      <w:r>
+        <w:rPr>
+          <w:rStyle w:val="NormalTok"/>
+        </w:rPr>
+        <w:t xml:space="preserve">    </w:t>
+      </w:r>
+      <w:r>
+        <w:rPr>
+          <w:rStyle w:val="BuiltInTok"/>
+        </w:rPr>
+        <w:t xml:space="preserve">print</w:t>
+      </w:r>
+      <w:r>
+        <w:rPr>
+          <w:rStyle w:val="NormalTok"/>
+        </w:rPr>
+        <w:t xml:space="preserve">(</w:t>
+      </w:r>
+      <w:r>
+        <w:rPr>
+          <w:rStyle w:val="StringTok"/>
+        </w:rPr>
+        <w:t xml:space="preserve">"</w:t>
+      </w:r>
+      <w:r>
+        <w:rPr>
+          <w:rStyle w:val="CharTok"/>
+        </w:rPr>
+        <w:t xml:space="preserve">\n</w:t>
+      </w:r>
+      <w:r>
+        <w:rPr>
+          <w:rStyle w:val="StringTok"/>
+        </w:rPr>
+        <w:t xml:space="preserve">Análisis de sensibilidad:"</w:t>
+      </w:r>
+      <w:r>
+        <w:rPr>
+          <w:rStyle w:val="NormalTok"/>
+        </w:rPr>
+        <w:t xml:space="preserve">)</w:t>
+      </w:r>
+      <w:r>
+        <w:br/>
+      </w:r>
+      <w:r>
+        <w:rPr>
+          <w:rStyle w:val="NormalTok"/>
+        </w:rPr>
+        <w:t xml:space="preserve">    unidades_vender </w:t>
       </w:r>
       <w:r>
         <w:rPr>
@@ -24957,13 +27486,139 @@
         <w:rPr>
           <w:rStyle w:val="NormalTok"/>
         </w:rPr>
-        <w:t xml:space="preserve"> costos_fijos </w:t>
-      </w:r>
-      <w:r>
-        <w:rPr>
-          <w:rStyle w:val="OperatorTok"/>
-        </w:rPr>
-        <w:t xml:space="preserve">/</w:t>
+        <w:t xml:space="preserve"> </w:t>
+      </w:r>
+      <w:r>
+        <w:rPr>
+          <w:rStyle w:val="BuiltInTok"/>
+        </w:rPr>
+        <w:t xml:space="preserve">float</w:t>
+      </w:r>
+      <w:r>
+        <w:rPr>
+          <w:rStyle w:val="NormalTok"/>
+        </w:rPr>
+        <w:t xml:space="preserve">(</w:t>
+      </w:r>
+      <w:r>
+        <w:rPr>
+          <w:rStyle w:val="BuiltInTok"/>
+        </w:rPr>
+        <w:t xml:space="preserve">input</w:t>
+      </w:r>
+      <w:r>
+        <w:rPr>
+          <w:rStyle w:val="NormalTok"/>
+        </w:rPr>
+        <w:t xml:space="preserve">(</w:t>
+      </w:r>
+      <w:r>
+        <w:rPr>
+          <w:rStyle w:val="StringTok"/>
+        </w:rPr>
+        <w:t xml:space="preserve">"¿Cuántas unidades espera vender? "</w:t>
+      </w:r>
+      <w:r>
+        <w:rPr>
+          <w:rStyle w:val="NormalTok"/>
+        </w:rPr>
+        <w:t xml:space="preserve">))</w:t>
+      </w:r>
+      <w:r>
+        <w:br/>
+      </w:r>
+      <w:r>
+        <w:br/>
+      </w:r>
+      <w:r>
+        <w:rPr>
+          <w:rStyle w:val="NormalTok"/>
+        </w:rPr>
+        <w:t xml:space="preserve">    </w:t>
+      </w:r>
+      <w:r>
+        <w:rPr>
+          <w:rStyle w:val="ControlFlowTok"/>
+        </w:rPr>
+        <w:t xml:space="preserve">if</w:t>
+      </w:r>
+      <w:r>
+        <w:rPr>
+          <w:rStyle w:val="NormalTok"/>
+        </w:rPr>
+        <w:t xml:space="preserve"> unidades_vender </w:t>
+      </w:r>
+      <w:r>
+        <w:rPr>
+          <w:rStyle w:val="OperatorTok"/>
+        </w:rPr>
+        <w:t xml:space="preserve">&gt;</w:t>
+      </w:r>
+      <w:r>
+        <w:rPr>
+          <w:rStyle w:val="NormalTok"/>
+        </w:rPr>
+        <w:t xml:space="preserve"> punto_equilibrio_unidades:</w:t>
+      </w:r>
+      <w:r>
+        <w:br/>
+      </w:r>
+      <w:r>
+        <w:rPr>
+          <w:rStyle w:val="NormalTok"/>
+        </w:rPr>
+        <w:t xml:space="preserve">        diferencia </w:t>
+      </w:r>
+      <w:r>
+        <w:rPr>
+          <w:rStyle w:val="OperatorTok"/>
+        </w:rPr>
+        <w:t xml:space="preserve">=</w:t>
+      </w:r>
+      <w:r>
+        <w:rPr>
+          <w:rStyle w:val="NormalTok"/>
+        </w:rPr>
+        <w:t xml:space="preserve"> unidades_vender </w:t>
+      </w:r>
+      <w:r>
+        <w:rPr>
+          <w:rStyle w:val="OperatorTok"/>
+        </w:rPr>
+        <w:t xml:space="preserve">-</w:t>
+      </w:r>
+      <w:r>
+        <w:rPr>
+          <w:rStyle w:val="NormalTok"/>
+        </w:rPr>
+        <w:t xml:space="preserve"> punto_equilibrio_unidades</w:t>
+      </w:r>
+      <w:r>
+        <w:br/>
+      </w:r>
+      <w:r>
+        <w:rPr>
+          <w:rStyle w:val="NormalTok"/>
+        </w:rPr>
+        <w:t xml:space="preserve">        utilidad </w:t>
+      </w:r>
+      <w:r>
+        <w:rPr>
+          <w:rStyle w:val="OperatorTok"/>
+        </w:rPr>
+        <w:t xml:space="preserve">=</w:t>
+      </w:r>
+      <w:r>
+        <w:rPr>
+          <w:rStyle w:val="NormalTok"/>
+        </w:rPr>
+        <w:t xml:space="preserve"> diferencia </w:t>
+      </w:r>
+      <w:r>
+        <w:rPr>
+          <w:rStyle w:val="OperatorTok"/>
+        </w:rPr>
+        <w:t xml:space="preserve">*</w:t>
       </w:r>
       <w:r>
         <w:rPr>
@@ -24978,7 +27633,130 @@
         <w:rPr>
           <w:rStyle w:val="NormalTok"/>
         </w:rPr>
-        <w:t xml:space="preserve">    punto_equilibrio_soles </w:t>
+        <w:t xml:space="preserve">        </w:t>
+      </w:r>
+      <w:r>
+        <w:rPr>
+          <w:rStyle w:val="BuiltInTok"/>
+        </w:rPr>
+        <w:t xml:space="preserve">print</w:t>
+      </w:r>
+      <w:r>
+        <w:rPr>
+          <w:rStyle w:val="NormalTok"/>
+        </w:rPr>
+        <w:t xml:space="preserve">(</w:t>
+      </w:r>
+      <w:r>
+        <w:rPr>
+          <w:rStyle w:val="SpecialStringTok"/>
+        </w:rPr>
+        <w:t xml:space="preserve">f"Utilidad esperada: S/ </w:t>
+      </w:r>
+      <w:r>
+        <w:rPr>
+          <w:rStyle w:val="SpecialCharTok"/>
+        </w:rPr>
+        <w:t xml:space="preserve">{</w:t>
+      </w:r>
+      <w:r>
+        <w:rPr>
+          <w:rStyle w:val="NormalTok"/>
+        </w:rPr>
+        <w:t xml:space="preserve">utilidad</w:t>
+      </w:r>
+      <w:r>
+        <w:rPr>
+          <w:rStyle w:val="SpecialCharTok"/>
+        </w:rPr>
+        <w:t xml:space="preserve">:,.2f}</w:t>
+      </w:r>
+      <w:r>
+        <w:rPr>
+          <w:rStyle w:val="SpecialStringTok"/>
+        </w:rPr>
+        <w:t xml:space="preserve">"</w:t>
+      </w:r>
+      <w:r>
+        <w:rPr>
+          <w:rStyle w:val="NormalTok"/>
+        </w:rPr>
+        <w:t xml:space="preserve">)</w:t>
+      </w:r>
+      <w:r>
+        <w:br/>
+      </w:r>
+      <w:r>
+        <w:rPr>
+          <w:rStyle w:val="NormalTok"/>
+        </w:rPr>
+        <w:t xml:space="preserve">        </w:t>
+      </w:r>
+      <w:r>
+        <w:rPr>
+          <w:rStyle w:val="BuiltInTok"/>
+        </w:rPr>
+        <w:t xml:space="preserve">print</w:t>
+      </w:r>
+      <w:r>
+        <w:rPr>
+          <w:rStyle w:val="NormalTok"/>
+        </w:rPr>
+        <w:t xml:space="preserve">(</w:t>
+      </w:r>
+      <w:r>
+        <w:rPr>
+          <w:rStyle w:val="StringTok"/>
+        </w:rPr>
+        <w:t xml:space="preserve">"La empresa obtendría ganancias."</w:t>
+      </w:r>
+      <w:r>
+        <w:rPr>
+          <w:rStyle w:val="NormalTok"/>
+        </w:rPr>
+        <w:t xml:space="preserve">)</w:t>
+      </w:r>
+      <w:r>
+        <w:br/>
+      </w:r>
+      <w:r>
+        <w:rPr>
+          <w:rStyle w:val="NormalTok"/>
+        </w:rPr>
+        <w:t xml:space="preserve">    </w:t>
+      </w:r>
+      <w:r>
+        <w:rPr>
+          <w:rStyle w:val="ControlFlowTok"/>
+        </w:rPr>
+        <w:t xml:space="preserve">elif</w:t>
+      </w:r>
+      <w:r>
+        <w:rPr>
+          <w:rStyle w:val="NormalTok"/>
+        </w:rPr>
+        <w:t xml:space="preserve"> unidades_vender </w:t>
+      </w:r>
+      <w:r>
+        <w:rPr>
+          <w:rStyle w:val="OperatorTok"/>
+        </w:rPr>
+        <w:t xml:space="preserve">&lt;</w:t>
+      </w:r>
+      <w:r>
+        <w:rPr>
+          <w:rStyle w:val="NormalTok"/>
+        </w:rPr>
+        <w:t xml:space="preserve"> punto_equilibrio_unidades:</w:t>
+      </w:r>
+      <w:r>
+        <w:br/>
+      </w:r>
+      <w:r>
+        <w:rPr>
+          <w:rStyle w:val="NormalTok"/>
+        </w:rPr>
+        <w:t xml:space="preserve">        diferencia </w:t>
       </w:r>
       <w:r>
         <w:rPr>
@@ -24996,13 +27774,136 @@
         <w:rPr>
           <w:rStyle w:val="OperatorTok"/>
         </w:rPr>
+        <w:t xml:space="preserve">-</w:t>
+      </w:r>
+      <w:r>
+        <w:rPr>
+          <w:rStyle w:val="NormalTok"/>
+        </w:rPr>
+        <w:t xml:space="preserve"> unidades_vender</w:t>
+      </w:r>
+      <w:r>
+        <w:br/>
+      </w:r>
+      <w:r>
+        <w:rPr>
+          <w:rStyle w:val="NormalTok"/>
+        </w:rPr>
+        <w:t xml:space="preserve">        perdida </w:t>
+      </w:r>
+      <w:r>
+        <w:rPr>
+          <w:rStyle w:val="OperatorTok"/>
+        </w:rPr>
+        <w:t xml:space="preserve">=</w:t>
+      </w:r>
+      <w:r>
+        <w:rPr>
+          <w:rStyle w:val="NormalTok"/>
+        </w:rPr>
+        <w:t xml:space="preserve"> diferencia </w:t>
+      </w:r>
+      <w:r>
+        <w:rPr>
+          <w:rStyle w:val="OperatorTok"/>
+        </w:rPr>
         <w:t xml:space="preserve">*</w:t>
       </w:r>
       <w:r>
         <w:rPr>
           <w:rStyle w:val="NormalTok"/>
         </w:rPr>
-        <w:t xml:space="preserve"> precio_venta_unitario</w:t>
+        <w:t xml:space="preserve"> margen_contribucion_unitario</w:t>
+      </w:r>
+      <w:r>
+        <w:br/>
+      </w:r>
+      <w:r>
+        <w:rPr>
+          <w:rStyle w:val="NormalTok"/>
+        </w:rPr>
+        <w:t xml:space="preserve">        </w:t>
+      </w:r>
+      <w:r>
+        <w:rPr>
+          <w:rStyle w:val="BuiltInTok"/>
+        </w:rPr>
+        <w:t xml:space="preserve">print</w:t>
+      </w:r>
+      <w:r>
+        <w:rPr>
+          <w:rStyle w:val="NormalTok"/>
+        </w:rPr>
+        <w:t xml:space="preserve">(</w:t>
+      </w:r>
+      <w:r>
+        <w:rPr>
+          <w:rStyle w:val="SpecialStringTok"/>
+        </w:rPr>
+        <w:t xml:space="preserve">f"Pérdida esperada: S/ </w:t>
+      </w:r>
+      <w:r>
+        <w:rPr>
+          <w:rStyle w:val="SpecialCharTok"/>
+        </w:rPr>
+        <w:t xml:space="preserve">{</w:t>
+      </w:r>
+      <w:r>
+        <w:rPr>
+          <w:rStyle w:val="NormalTok"/>
+        </w:rPr>
+        <w:t xml:space="preserve">perdida</w:t>
+      </w:r>
+      <w:r>
+        <w:rPr>
+          <w:rStyle w:val="SpecialCharTok"/>
+        </w:rPr>
+        <w:t xml:space="preserve">:,.2f}</w:t>
+      </w:r>
+      <w:r>
+        <w:rPr>
+          <w:rStyle w:val="SpecialStringTok"/>
+        </w:rPr>
+        <w:t xml:space="preserve">"</w:t>
+      </w:r>
+      <w:r>
+        <w:rPr>
+          <w:rStyle w:val="NormalTok"/>
+        </w:rPr>
+        <w:t xml:space="preserve">)</w:t>
+      </w:r>
+      <w:r>
+        <w:br/>
+      </w:r>
+      <w:r>
+        <w:rPr>
+          <w:rStyle w:val="NormalTok"/>
+        </w:rPr>
+        <w:t xml:space="preserve">        </w:t>
+      </w:r>
+      <w:r>
+        <w:rPr>
+          <w:rStyle w:val="BuiltInTok"/>
+        </w:rPr>
+        <w:t xml:space="preserve">print</w:t>
+      </w:r>
+      <w:r>
+        <w:rPr>
+          <w:rStyle w:val="NormalTok"/>
+        </w:rPr>
+        <w:t xml:space="preserve">(</w:t>
+      </w:r>
+      <w:r>
+        <w:rPr>
+          <w:rStyle w:val="StringTok"/>
+        </w:rPr>
+        <w:t xml:space="preserve">"La empresa tendría pérdidas."</w:t>
+      </w:r>
+      <w:r>
+        <w:rPr>
+          <w:rStyle w:val="NormalTok"/>
+        </w:rPr>
+        <w:t xml:space="preserve">)</w:t>
       </w:r>
       <w:r>
         <w:br/>
@@ -25014,28 +27915,25 @@
         <w:t xml:space="preserve">    </w:t>
       </w:r>
       <w:r>
-        <w:br/>
-      </w:r>
-      <w:r>
-        <w:rPr>
-          <w:rStyle w:val="NormalTok"/>
-        </w:rPr>
-        <w:t xml:space="preserve">    </w:t>
-      </w:r>
-      <w:r>
-        <w:rPr>
-          <w:rStyle w:val="CommentTok"/>
-        </w:rPr>
-        <w:t xml:space="preserve"># Resultados</w:t>
-      </w:r>
-      <w:r>
-        <w:br/>
-      </w:r>
-      <w:r>
-        <w:rPr>
-          <w:rStyle w:val="NormalTok"/>
-        </w:rPr>
-        <w:t xml:space="preserve">    </w:t>
+        <w:rPr>
+          <w:rStyle w:val="ControlFlowTok"/>
+        </w:rPr>
+        <w:t xml:space="preserve">else</w:t>
+      </w:r>
+      <w:r>
+        <w:rPr>
+          <w:rStyle w:val="NormalTok"/>
+        </w:rPr>
+        <w:t xml:space="preserve">:</w:t>
+      </w:r>
+      <w:r>
+        <w:br/>
+      </w:r>
+      <w:r>
+        <w:rPr>
+          <w:rStyle w:val="NormalTok"/>
+        </w:rPr>
+        <w:t xml:space="preserve">        </w:t>
       </w:r>
       <w:r>
         <w:rPr>
@@ -25050,1282 +27948,28 @@
         <w:t xml:space="preserve">(</w:t>
       </w:r>
       <w:r>
+        <w:br/>
+      </w:r>
+      <w:r>
+        <w:rPr>
+          <w:rStyle w:val="NormalTok"/>
+        </w:rPr>
+        <w:t xml:space="preserve">            </w:t>
+      </w:r>
+      <w:r>
         <w:rPr>
           <w:rStyle w:val="StringTok"/>
         </w:rPr>
-        <w:t xml:space="preserve">"</w:t>
-      </w:r>
-      <w:r>
-        <w:rPr>
-          <w:rStyle w:val="CharTok"/>
-        </w:rPr>
-        <w:t xml:space="preserve">\n</w:t>
-      </w:r>
-      <w:r>
-        <w:rPr>
-          <w:rStyle w:val="StringTok"/>
-        </w:rPr>
-        <w:t xml:space="preserve">"</w:t>
-      </w:r>
-      <w:r>
-        <w:rPr>
-          <w:rStyle w:val="NormalTok"/>
-        </w:rPr>
-        <w:t xml:space="preserve"> </w:t>
-      </w:r>
-      <w:r>
-        <w:rPr>
-          <w:rStyle w:val="OperatorTok"/>
-        </w:rPr>
-        <w:t xml:space="preserve">+</w:t>
-      </w:r>
-      <w:r>
-        <w:rPr>
-          <w:rStyle w:val="NormalTok"/>
-        </w:rPr>
-        <w:t xml:space="preserve"> </w:t>
-      </w:r>
-      <w:r>
-        <w:rPr>
-          <w:rStyle w:val="StringTok"/>
-        </w:rPr>
-        <w:t xml:space="preserve">"="</w:t>
-      </w:r>
-      <w:r>
-        <w:rPr>
-          <w:rStyle w:val="NormalTok"/>
-        </w:rPr>
-        <w:t xml:space="preserve"> </w:t>
-      </w:r>
-      <w:r>
-        <w:rPr>
-          <w:rStyle w:val="OperatorTok"/>
-        </w:rPr>
-        <w:t xml:space="preserve">*</w:t>
-      </w:r>
-      <w:r>
-        <w:rPr>
-          <w:rStyle w:val="NormalTok"/>
-        </w:rPr>
-        <w:t xml:space="preserve"> </w:t>
-      </w:r>
-      <w:r>
-        <w:rPr>
-          <w:rStyle w:val="DecValTok"/>
-        </w:rPr>
-        <w:t xml:space="preserve">50</w:t>
-      </w:r>
-      <w:r>
-        <w:rPr>
-          <w:rStyle w:val="NormalTok"/>
-        </w:rPr>
-        <w:t xml:space="preserve">)</w:t>
-      </w:r>
-      <w:r>
-        <w:br/>
-      </w:r>
-      <w:r>
-        <w:rPr>
-          <w:rStyle w:val="NormalTok"/>
-        </w:rPr>
-        <w:t xml:space="preserve">    </w:t>
-      </w:r>
-      <w:r>
-        <w:rPr>
-          <w:rStyle w:val="BuiltInTok"/>
-        </w:rPr>
-        <w:t xml:space="preserve">print</w:t>
-      </w:r>
-      <w:r>
-        <w:rPr>
-          <w:rStyle w:val="NormalTok"/>
-        </w:rPr>
-        <w:t xml:space="preserve">(</w:t>
-      </w:r>
-      <w:r>
-        <w:rPr>
-          <w:rStyle w:val="StringTok"/>
-        </w:rPr>
-        <w:t xml:space="preserve">"RESULTADOS DEL ANÁLISIS"</w:t>
-      </w:r>
-      <w:r>
-        <w:rPr>
-          <w:rStyle w:val="NormalTok"/>
-        </w:rPr>
-        <w:t xml:space="preserve">)</w:t>
-      </w:r>
-      <w:r>
-        <w:br/>
-      </w:r>
-      <w:r>
-        <w:rPr>
-          <w:rStyle w:val="NormalTok"/>
-        </w:rPr>
-        <w:t xml:space="preserve">    </w:t>
-      </w:r>
-      <w:r>
-        <w:rPr>
-          <w:rStyle w:val="BuiltInTok"/>
-        </w:rPr>
-        <w:t xml:space="preserve">print</w:t>
-      </w:r>
-      <w:r>
-        <w:rPr>
-          <w:rStyle w:val="NormalTok"/>
-        </w:rPr>
-        <w:t xml:space="preserve">(</w:t>
-      </w:r>
-      <w:r>
-        <w:rPr>
-          <w:rStyle w:val="StringTok"/>
-        </w:rPr>
-        <w:t xml:space="preserve">"="</w:t>
-      </w:r>
-      <w:r>
-        <w:rPr>
-          <w:rStyle w:val="NormalTok"/>
-        </w:rPr>
-        <w:t xml:space="preserve"> </w:t>
-      </w:r>
-      <w:r>
-        <w:rPr>
-          <w:rStyle w:val="OperatorTok"/>
-        </w:rPr>
-        <w:t xml:space="preserve">*</w:t>
-      </w:r>
-      <w:r>
-        <w:rPr>
-          <w:rStyle w:val="NormalTok"/>
-        </w:rPr>
-        <w:t xml:space="preserve"> </w:t>
-      </w:r>
-      <w:r>
-        <w:rPr>
-          <w:rStyle w:val="DecValTok"/>
-        </w:rPr>
-        <w:t xml:space="preserve">50</w:t>
-      </w:r>
-      <w:r>
-        <w:rPr>
-          <w:rStyle w:val="NormalTok"/>
-        </w:rPr>
-        <w:t xml:space="preserve">)</w:t>
-      </w:r>
-      <w:r>
-        <w:br/>
-      </w:r>
-      <w:r>
-        <w:rPr>
-          <w:rStyle w:val="NormalTok"/>
-        </w:rPr>
-        <w:t xml:space="preserve">    </w:t>
-      </w:r>
-      <w:r>
-        <w:rPr>
-          <w:rStyle w:val="BuiltInTok"/>
-        </w:rPr>
-        <w:t xml:space="preserve">print</w:t>
-      </w:r>
-      <w:r>
-        <w:rPr>
-          <w:rStyle w:val="NormalTok"/>
-        </w:rPr>
-        <w:t xml:space="preserve">(</w:t>
-      </w:r>
-      <w:r>
-        <w:rPr>
-          <w:rStyle w:val="SpecialStringTok"/>
-        </w:rPr>
-        <w:t xml:space="preserve">f"Costos fijos:                 S/ </w:t>
-      </w:r>
-      <w:r>
-        <w:rPr>
-          <w:rStyle w:val="SpecialCharTok"/>
-        </w:rPr>
-        <w:t xml:space="preserve">{</w:t>
-      </w:r>
-      <w:r>
-        <w:rPr>
-          <w:rStyle w:val="NormalTok"/>
-        </w:rPr>
-        <w:t xml:space="preserve">costos_fijos</w:t>
-      </w:r>
-      <w:r>
-        <w:rPr>
-          <w:rStyle w:val="SpecialCharTok"/>
-        </w:rPr>
-        <w:t xml:space="preserve">:,.2f}</w:t>
-      </w:r>
-      <w:r>
-        <w:rPr>
-          <w:rStyle w:val="SpecialStringTok"/>
-        </w:rPr>
-        <w:t xml:space="preserve">"</w:t>
-      </w:r>
-      <w:r>
-        <w:rPr>
-          <w:rStyle w:val="NormalTok"/>
-        </w:rPr>
-        <w:t xml:space="preserve">)</w:t>
-      </w:r>
-      <w:r>
-        <w:br/>
-      </w:r>
-      <w:r>
-        <w:rPr>
-          <w:rStyle w:val="NormalTok"/>
-        </w:rPr>
-        <w:t xml:space="preserve">    </w:t>
-      </w:r>
-      <w:r>
-        <w:rPr>
-          <w:rStyle w:val="BuiltInTok"/>
-        </w:rPr>
-        <w:t xml:space="preserve">print</w:t>
-      </w:r>
-      <w:r>
-        <w:rPr>
-          <w:rStyle w:val="NormalTok"/>
-        </w:rPr>
-        <w:t xml:space="preserve">(</w:t>
-      </w:r>
-      <w:r>
-        <w:rPr>
-          <w:rStyle w:val="SpecialStringTok"/>
-        </w:rPr>
-        <w:t xml:space="preserve">f"Costo variable unitario:      S/ </w:t>
-      </w:r>
-      <w:r>
-        <w:rPr>
-          <w:rStyle w:val="SpecialCharTok"/>
-        </w:rPr>
-        <w:t xml:space="preserve">{</w:t>
-      </w:r>
-      <w:r>
-        <w:rPr>
-          <w:rStyle w:val="NormalTok"/>
-        </w:rPr>
-        <w:t xml:space="preserve">costo_variable_unitario</w:t>
-      </w:r>
-      <w:r>
-        <w:rPr>
-          <w:rStyle w:val="SpecialCharTok"/>
-        </w:rPr>
-        <w:t xml:space="preserve">:,.2f}</w:t>
-      </w:r>
-      <w:r>
-        <w:rPr>
-          <w:rStyle w:val="SpecialStringTok"/>
-        </w:rPr>
-        <w:t xml:space="preserve">"</w:t>
-      </w:r>
-      <w:r>
-        <w:rPr>
-          <w:rStyle w:val="NormalTok"/>
-        </w:rPr>
-        <w:t xml:space="preserve">)</w:t>
-      </w:r>
-      <w:r>
-        <w:br/>
-      </w:r>
-      <w:r>
-        <w:rPr>
-          <w:rStyle w:val="NormalTok"/>
-        </w:rPr>
-        <w:t xml:space="preserve">    </w:t>
-      </w:r>
-      <w:r>
-        <w:rPr>
-          <w:rStyle w:val="BuiltInTok"/>
-        </w:rPr>
-        <w:t xml:space="preserve">print</w:t>
-      </w:r>
-      <w:r>
-        <w:rPr>
-          <w:rStyle w:val="NormalTok"/>
-        </w:rPr>
-        <w:t xml:space="preserve">(</w:t>
-      </w:r>
-      <w:r>
-        <w:rPr>
-          <w:rStyle w:val="SpecialStringTok"/>
-        </w:rPr>
-        <w:t xml:space="preserve">f"Precio de venta unitario:     S/ </w:t>
-      </w:r>
-      <w:r>
-        <w:rPr>
-          <w:rStyle w:val="SpecialCharTok"/>
-        </w:rPr>
-        <w:t xml:space="preserve">{</w:t>
-      </w:r>
-      <w:r>
-        <w:rPr>
-          <w:rStyle w:val="NormalTok"/>
-        </w:rPr>
-        <w:t xml:space="preserve">precio_venta_unitario</w:t>
-      </w:r>
-      <w:r>
-        <w:rPr>
-          <w:rStyle w:val="SpecialCharTok"/>
-        </w:rPr>
-        <w:t xml:space="preserve">:,.2f}</w:t>
-      </w:r>
-      <w:r>
-        <w:rPr>
-          <w:rStyle w:val="SpecialStringTok"/>
-        </w:rPr>
-        <w:t xml:space="preserve">"</w:t>
-      </w:r>
-      <w:r>
-        <w:rPr>
-          <w:rStyle w:val="NormalTok"/>
-        </w:rPr>
-        <w:t xml:space="preserve">)</w:t>
-      </w:r>
-      <w:r>
-        <w:br/>
-      </w:r>
-      <w:r>
-        <w:rPr>
-          <w:rStyle w:val="NormalTok"/>
-        </w:rPr>
-        <w:t xml:space="preserve">    </w:t>
-      </w:r>
-      <w:r>
-        <w:rPr>
-          <w:rStyle w:val="BuiltInTok"/>
-        </w:rPr>
-        <w:t xml:space="preserve">print</w:t>
-      </w:r>
-      <w:r>
-        <w:rPr>
-          <w:rStyle w:val="NormalTok"/>
-        </w:rPr>
-        <w:t xml:space="preserve">(</w:t>
-      </w:r>
-      <w:r>
-        <w:rPr>
-          <w:rStyle w:val="SpecialStringTok"/>
-        </w:rPr>
-        <w:t xml:space="preserve">f"Margen de contribución:       S/ </w:t>
-      </w:r>
-      <w:r>
-        <w:rPr>
-          <w:rStyle w:val="SpecialCharTok"/>
-        </w:rPr>
-        <w:t xml:space="preserve">{</w:t>
-      </w:r>
-      <w:r>
-        <w:rPr>
-          <w:rStyle w:val="NormalTok"/>
-        </w:rPr>
-        <w:t xml:space="preserve">margen_contribucion_unitario</w:t>
-      </w:r>
-      <w:r>
-        <w:rPr>
-          <w:rStyle w:val="SpecialCharTok"/>
-        </w:rPr>
-        <w:t xml:space="preserve">:,.2f}</w:t>
-      </w:r>
-      <w:r>
-        <w:rPr>
-          <w:rStyle w:val="SpecialStringTok"/>
-        </w:rPr>
-        <w:t xml:space="preserve">"</w:t>
-      </w:r>
-      <w:r>
-        <w:rPr>
-          <w:rStyle w:val="NormalTok"/>
-        </w:rPr>
-        <w:t xml:space="preserve">)</w:t>
-      </w:r>
-      <w:r>
-        <w:br/>
-      </w:r>
-      <w:r>
-        <w:rPr>
-          <w:rStyle w:val="NormalTok"/>
-        </w:rPr>
-        <w:t xml:space="preserve">    </w:t>
-      </w:r>
-      <w:r>
-        <w:rPr>
-          <w:rStyle w:val="BuiltInTok"/>
-        </w:rPr>
-        <w:t xml:space="preserve">print</w:t>
-      </w:r>
-      <w:r>
-        <w:rPr>
-          <w:rStyle w:val="NormalTok"/>
-        </w:rPr>
-        <w:t xml:space="preserve">(</w:t>
-      </w:r>
-      <w:r>
-        <w:rPr>
-          <w:rStyle w:val="SpecialStringTok"/>
-        </w:rPr>
-        <w:t xml:space="preserve">f"Margen de contribución:       </w:t>
-      </w:r>
-      <w:r>
-        <w:rPr>
-          <w:rStyle w:val="SpecialCharTok"/>
-        </w:rPr>
-        <w:t xml:space="preserve">{</w:t>
-      </w:r>
-      <w:r>
-        <w:rPr>
-          <w:rStyle w:val="NormalTok"/>
-        </w:rPr>
-        <w:t xml:space="preserve">margen_contribucion_porcentaje</w:t>
-      </w:r>
-      <w:r>
-        <w:rPr>
-          <w:rStyle w:val="SpecialCharTok"/>
-        </w:rPr>
-        <w:t xml:space="preserve">:.1f}</w:t>
-      </w:r>
-      <w:r>
-        <w:rPr>
-          <w:rStyle w:val="SpecialStringTok"/>
-        </w:rPr>
-        <w:t xml:space="preserve">%"</w:t>
-      </w:r>
-      <w:r>
-        <w:rPr>
-          <w:rStyle w:val="NormalTok"/>
-        </w:rPr>
-        <w:t xml:space="preserve">)</w:t>
-      </w:r>
-      <w:r>
-        <w:br/>
-      </w:r>
-      <w:r>
-        <w:rPr>
-          <w:rStyle w:val="NormalTok"/>
-        </w:rPr>
-        <w:t xml:space="preserve">    </w:t>
-      </w:r>
-      <w:r>
-        <w:rPr>
-          <w:rStyle w:val="BuiltInTok"/>
-        </w:rPr>
-        <w:t xml:space="preserve">print</w:t>
-      </w:r>
-      <w:r>
-        <w:rPr>
-          <w:rStyle w:val="NormalTok"/>
-        </w:rPr>
-        <w:t xml:space="preserve">(</w:t>
-      </w:r>
-      <w:r>
-        <w:rPr>
-          <w:rStyle w:val="StringTok"/>
-        </w:rPr>
-        <w:t xml:space="preserve">"</w:t>
-      </w:r>
-      <w:r>
-        <w:rPr>
-          <w:rStyle w:val="CharTok"/>
-        </w:rPr>
-        <w:t xml:space="preserve">\n</w:t>
-      </w:r>
-      <w:r>
-        <w:rPr>
-          <w:rStyle w:val="StringTok"/>
-        </w:rPr>
-        <w:t xml:space="preserve">"</w:t>
-      </w:r>
-      <w:r>
-        <w:rPr>
-          <w:rStyle w:val="NormalTok"/>
-        </w:rPr>
-        <w:t xml:space="preserve"> </w:t>
-      </w:r>
-      <w:r>
-        <w:rPr>
-          <w:rStyle w:val="OperatorTok"/>
-        </w:rPr>
-        <w:t xml:space="preserve">+</w:t>
-      </w:r>
-      <w:r>
-        <w:rPr>
-          <w:rStyle w:val="NormalTok"/>
-        </w:rPr>
-        <w:t xml:space="preserve"> </w:t>
-      </w:r>
-      <w:r>
-        <w:rPr>
-          <w:rStyle w:val="StringTok"/>
-        </w:rPr>
-        <w:t xml:space="preserve">"-"</w:t>
-      </w:r>
-      <w:r>
-        <w:rPr>
-          <w:rStyle w:val="NormalTok"/>
-        </w:rPr>
-        <w:t xml:space="preserve"> </w:t>
-      </w:r>
-      <w:r>
-        <w:rPr>
-          <w:rStyle w:val="OperatorTok"/>
-        </w:rPr>
-        <w:t xml:space="preserve">*</w:t>
-      </w:r>
-      <w:r>
-        <w:rPr>
-          <w:rStyle w:val="NormalTok"/>
-        </w:rPr>
-        <w:t xml:space="preserve"> </w:t>
-      </w:r>
-      <w:r>
-        <w:rPr>
-          <w:rStyle w:val="DecValTok"/>
-        </w:rPr>
-        <w:t xml:space="preserve">50</w:t>
-      </w:r>
-      <w:r>
-        <w:rPr>
-          <w:rStyle w:val="NormalTok"/>
-        </w:rPr>
-        <w:t xml:space="preserve">)</w:t>
-      </w:r>
-      <w:r>
-        <w:br/>
-      </w:r>
-      <w:r>
-        <w:rPr>
-          <w:rStyle w:val="NormalTok"/>
-        </w:rPr>
-        <w:t xml:space="preserve">    </w:t>
-      </w:r>
-      <w:r>
-        <w:rPr>
-          <w:rStyle w:val="BuiltInTok"/>
-        </w:rPr>
-        <w:t xml:space="preserve">print</w:t>
-      </w:r>
-      <w:r>
-        <w:rPr>
-          <w:rStyle w:val="NormalTok"/>
-        </w:rPr>
-        <w:t xml:space="preserve">(</w:t>
-      </w:r>
-      <w:r>
-        <w:rPr>
-          <w:rStyle w:val="SpecialStringTok"/>
-        </w:rPr>
-        <w:t xml:space="preserve">f"Punto de equilibrio:          </w:t>
-      </w:r>
-      <w:r>
-        <w:rPr>
-          <w:rStyle w:val="SpecialCharTok"/>
-        </w:rPr>
-        <w:t xml:space="preserve">{</w:t>
-      </w:r>
-      <w:r>
-        <w:rPr>
-          <w:rStyle w:val="NormalTok"/>
-        </w:rPr>
-        <w:t xml:space="preserve">punto_equilibrio_unidades</w:t>
-      </w:r>
-      <w:r>
-        <w:rPr>
-          <w:rStyle w:val="SpecialCharTok"/>
-        </w:rPr>
-        <w:t xml:space="preserve">:.0f}</w:t>
-      </w:r>
-      <w:r>
-        <w:rPr>
-          <w:rStyle w:val="SpecialStringTok"/>
-        </w:rPr>
-        <w:t xml:space="preserve"> unidades"</w:t>
-      </w:r>
-      <w:r>
-        <w:rPr>
-          <w:rStyle w:val="NormalTok"/>
-        </w:rPr>
-        <w:t xml:space="preserve">)</w:t>
-      </w:r>
-      <w:r>
-        <w:br/>
-      </w:r>
-      <w:r>
-        <w:rPr>
-          <w:rStyle w:val="NormalTok"/>
-        </w:rPr>
-        <w:t xml:space="preserve">    </w:t>
-      </w:r>
-      <w:r>
-        <w:rPr>
-          <w:rStyle w:val="BuiltInTok"/>
-        </w:rPr>
-        <w:t xml:space="preserve">print</w:t>
-      </w:r>
-      <w:r>
-        <w:rPr>
-          <w:rStyle w:val="NormalTok"/>
-        </w:rPr>
-        <w:t xml:space="preserve">(</w:t>
-      </w:r>
-      <w:r>
-        <w:rPr>
-          <w:rStyle w:val="SpecialStringTok"/>
-        </w:rPr>
-        <w:t xml:space="preserve">f"Punto de equilibrio:          S/ </w:t>
-      </w:r>
-      <w:r>
-        <w:rPr>
-          <w:rStyle w:val="SpecialCharTok"/>
-        </w:rPr>
-        <w:t xml:space="preserve">{</w:t>
-      </w:r>
-      <w:r>
-        <w:rPr>
-          <w:rStyle w:val="NormalTok"/>
-        </w:rPr>
-        <w:t xml:space="preserve">punto_equilibrio_soles</w:t>
-      </w:r>
-      <w:r>
-        <w:rPr>
-          <w:rStyle w:val="SpecialCharTok"/>
-        </w:rPr>
-        <w:t xml:space="preserve">:,.2f}</w:t>
-      </w:r>
-      <w:r>
-        <w:rPr>
-          <w:rStyle w:val="SpecialStringTok"/>
-        </w:rPr>
-        <w:t xml:space="preserve">"</w:t>
-      </w:r>
-      <w:r>
-        <w:rPr>
-          <w:rStyle w:val="NormalTok"/>
-        </w:rPr>
-        <w:t xml:space="preserve">)</w:t>
-      </w:r>
-      <w:r>
-        <w:br/>
-      </w:r>
-      <w:r>
-        <w:rPr>
-          <w:rStyle w:val="NormalTok"/>
-        </w:rPr>
-        <w:t xml:space="preserve">    </w:t>
-      </w:r>
-      <w:r>
-        <w:rPr>
-          <w:rStyle w:val="BuiltInTok"/>
-        </w:rPr>
-        <w:t xml:space="preserve">print</w:t>
-      </w:r>
-      <w:r>
-        <w:rPr>
-          <w:rStyle w:val="NormalTok"/>
-        </w:rPr>
-        <w:t xml:space="preserve">(</w:t>
-      </w:r>
-      <w:r>
-        <w:rPr>
-          <w:rStyle w:val="StringTok"/>
-        </w:rPr>
-        <w:t xml:space="preserve">"="</w:t>
-      </w:r>
-      <w:r>
-        <w:rPr>
-          <w:rStyle w:val="NormalTok"/>
-        </w:rPr>
-        <w:t xml:space="preserve"> </w:t>
-      </w:r>
-      <w:r>
-        <w:rPr>
-          <w:rStyle w:val="OperatorTok"/>
-        </w:rPr>
-        <w:t xml:space="preserve">*</w:t>
-      </w:r>
-      <w:r>
-        <w:rPr>
-          <w:rStyle w:val="NormalTok"/>
-        </w:rPr>
-        <w:t xml:space="preserve"> </w:t>
-      </w:r>
-      <w:r>
-        <w:rPr>
-          <w:rStyle w:val="DecValTok"/>
-        </w:rPr>
-        <w:t xml:space="preserve">50</w:t>
-      </w:r>
-      <w:r>
-        <w:rPr>
-          <w:rStyle w:val="NormalTok"/>
-        </w:rPr>
-        <w:t xml:space="preserve">)</w:t>
-      </w:r>
-      <w:r>
-        <w:br/>
-      </w:r>
-      <w:r>
-        <w:rPr>
-          <w:rStyle w:val="NormalTok"/>
-        </w:rPr>
-        <w:t xml:space="preserve">    </w:t>
-      </w:r>
-      <w:r>
-        <w:br/>
-      </w:r>
-      <w:r>
-        <w:rPr>
-          <w:rStyle w:val="NormalTok"/>
-        </w:rPr>
-        <w:t xml:space="preserve">    </w:t>
-      </w:r>
-      <w:r>
-        <w:rPr>
-          <w:rStyle w:val="CommentTok"/>
-        </w:rPr>
-        <w:t xml:space="preserve"># Análisis adicional</w:t>
-      </w:r>
-      <w:r>
-        <w:br/>
-      </w:r>
-      <w:r>
-        <w:rPr>
-          <w:rStyle w:val="NormalTok"/>
-        </w:rPr>
-        <w:t xml:space="preserve">    </w:t>
-      </w:r>
-      <w:r>
-        <w:rPr>
-          <w:rStyle w:val="BuiltInTok"/>
-        </w:rPr>
-        <w:t xml:space="preserve">print</w:t>
-      </w:r>
-      <w:r>
-        <w:rPr>
-          <w:rStyle w:val="NormalTok"/>
-        </w:rPr>
-        <w:t xml:space="preserve">(</w:t>
-      </w:r>
-      <w:r>
-        <w:rPr>
-          <w:rStyle w:val="StringTok"/>
-        </w:rPr>
-        <w:t xml:space="preserve">"</w:t>
-      </w:r>
-      <w:r>
-        <w:rPr>
-          <w:rStyle w:val="CharTok"/>
-        </w:rPr>
-        <w:t xml:space="preserve">\n</w:t>
-      </w:r>
-      <w:r>
-        <w:rPr>
-          <w:rStyle w:val="StringTok"/>
-        </w:rPr>
-        <w:t xml:space="preserve">Análisis de sensibilidad:"</w:t>
-      </w:r>
-      <w:r>
-        <w:rPr>
-          <w:rStyle w:val="NormalTok"/>
-        </w:rPr>
-        <w:t xml:space="preserve">)</w:t>
-      </w:r>
-      <w:r>
-        <w:br/>
-      </w:r>
-      <w:r>
-        <w:rPr>
-          <w:rStyle w:val="NormalTok"/>
-        </w:rPr>
-        <w:t xml:space="preserve">    unidades_vender </w:t>
-      </w:r>
-      <w:r>
-        <w:rPr>
-          <w:rStyle w:val="OperatorTok"/>
-        </w:rPr>
-        <w:t xml:space="preserve">=</w:t>
-      </w:r>
-      <w:r>
-        <w:rPr>
-          <w:rStyle w:val="NormalTok"/>
-        </w:rPr>
-        <w:t xml:space="preserve"> </w:t>
-      </w:r>
-      <w:r>
-        <w:rPr>
-          <w:rStyle w:val="BuiltInTok"/>
-        </w:rPr>
-        <w:t xml:space="preserve">float</w:t>
-      </w:r>
-      <w:r>
-        <w:rPr>
-          <w:rStyle w:val="NormalTok"/>
-        </w:rPr>
-        <w:t xml:space="preserve">(</w:t>
-      </w:r>
-      <w:r>
-        <w:rPr>
-          <w:rStyle w:val="BuiltInTok"/>
-        </w:rPr>
-        <w:t xml:space="preserve">input</w:t>
-      </w:r>
-      <w:r>
-        <w:rPr>
-          <w:rStyle w:val="NormalTok"/>
-        </w:rPr>
-        <w:t xml:space="preserve">(</w:t>
-      </w:r>
-      <w:r>
-        <w:rPr>
-          <w:rStyle w:val="StringTok"/>
-        </w:rPr>
-        <w:t xml:space="preserve">"¿Cuántas unidades espera vender? "</w:t>
-      </w:r>
-      <w:r>
-        <w:rPr>
-          <w:rStyle w:val="NormalTok"/>
-        </w:rPr>
-        <w:t xml:space="preserve">))</w:t>
-      </w:r>
-      <w:r>
-        <w:br/>
-      </w:r>
-      <w:r>
-        <w:rPr>
-          <w:rStyle w:val="NormalTok"/>
-        </w:rPr>
-        <w:t xml:space="preserve">    </w:t>
-      </w:r>
-      <w:r>
-        <w:br/>
-      </w:r>
-      <w:r>
-        <w:rPr>
-          <w:rStyle w:val="NormalTok"/>
-        </w:rPr>
-        <w:t xml:space="preserve">    </w:t>
-      </w:r>
-      <w:r>
-        <w:rPr>
-          <w:rStyle w:val="ControlFlowTok"/>
-        </w:rPr>
-        <w:t xml:space="preserve">if</w:t>
-      </w:r>
-      <w:r>
-        <w:rPr>
-          <w:rStyle w:val="NormalTok"/>
-        </w:rPr>
-        <w:t xml:space="preserve"> unidades_vender </w:t>
-      </w:r>
-      <w:r>
-        <w:rPr>
-          <w:rStyle w:val="OperatorTok"/>
-        </w:rPr>
-        <w:t xml:space="preserve">&gt;</w:t>
-      </w:r>
-      <w:r>
-        <w:rPr>
-          <w:rStyle w:val="NormalTok"/>
-        </w:rPr>
-        <w:t xml:space="preserve"> punto_equilibrio_unidades:</w:t>
-      </w:r>
-      <w:r>
-        <w:br/>
-      </w:r>
-      <w:r>
-        <w:rPr>
-          <w:rStyle w:val="NormalTok"/>
-        </w:rPr>
-        <w:t xml:space="preserve">        diferencia </w:t>
-      </w:r>
-      <w:r>
-        <w:rPr>
-          <w:rStyle w:val="OperatorTok"/>
-        </w:rPr>
-        <w:t xml:space="preserve">=</w:t>
-      </w:r>
-      <w:r>
-        <w:rPr>
-          <w:rStyle w:val="NormalTok"/>
-        </w:rPr>
-        <w:t xml:space="preserve"> unidades_vender </w:t>
-      </w:r>
-      <w:r>
-        <w:rPr>
-          <w:rStyle w:val="OperatorTok"/>
-        </w:rPr>
-        <w:t xml:space="preserve">-</w:t>
-      </w:r>
-      <w:r>
-        <w:rPr>
-          <w:rStyle w:val="NormalTok"/>
-        </w:rPr>
-        <w:t xml:space="preserve"> punto_equilibrio_unidades</w:t>
-      </w:r>
-      <w:r>
-        <w:br/>
-      </w:r>
-      <w:r>
-        <w:rPr>
-          <w:rStyle w:val="NormalTok"/>
-        </w:rPr>
-        <w:t xml:space="preserve">        utilidad </w:t>
-      </w:r>
-      <w:r>
-        <w:rPr>
-          <w:rStyle w:val="OperatorTok"/>
-        </w:rPr>
-        <w:t xml:space="preserve">=</w:t>
-      </w:r>
-      <w:r>
-        <w:rPr>
-          <w:rStyle w:val="NormalTok"/>
-        </w:rPr>
-        <w:t xml:space="preserve"> diferencia </w:t>
-      </w:r>
-      <w:r>
-        <w:rPr>
-          <w:rStyle w:val="OperatorTok"/>
-        </w:rPr>
-        <w:t xml:space="preserve">*</w:t>
-      </w:r>
-      <w:r>
-        <w:rPr>
-          <w:rStyle w:val="NormalTok"/>
-        </w:rPr>
-        <w:t xml:space="preserve"> margen_contribucion_unitario</w:t>
-      </w:r>
-      <w:r>
-        <w:br/>
-      </w:r>
-      <w:r>
-        <w:rPr>
-          <w:rStyle w:val="NormalTok"/>
-        </w:rPr>
-        <w:t xml:space="preserve">        </w:t>
-      </w:r>
-      <w:r>
-        <w:rPr>
-          <w:rStyle w:val="BuiltInTok"/>
-        </w:rPr>
-        <w:t xml:space="preserve">print</w:t>
-      </w:r>
-      <w:r>
-        <w:rPr>
-          <w:rStyle w:val="NormalTok"/>
-        </w:rPr>
-        <w:t xml:space="preserve">(</w:t>
-      </w:r>
-      <w:r>
-        <w:rPr>
-          <w:rStyle w:val="SpecialStringTok"/>
-        </w:rPr>
-        <w:t xml:space="preserve">f"Utilidad esperada: S/ </w:t>
-      </w:r>
-      <w:r>
-        <w:rPr>
-          <w:rStyle w:val="SpecialCharTok"/>
-        </w:rPr>
-        <w:t xml:space="preserve">{</w:t>
-      </w:r>
-      <w:r>
-        <w:rPr>
-          <w:rStyle w:val="NormalTok"/>
-        </w:rPr>
-        <w:t xml:space="preserve">utilidad</w:t>
-      </w:r>
-      <w:r>
-        <w:rPr>
-          <w:rStyle w:val="SpecialCharTok"/>
-        </w:rPr>
-        <w:t xml:space="preserve">:,.2f}</w:t>
-      </w:r>
-      <w:r>
-        <w:rPr>
-          <w:rStyle w:val="SpecialStringTok"/>
-        </w:rPr>
-        <w:t xml:space="preserve">"</w:t>
-      </w:r>
-      <w:r>
-        <w:rPr>
-          <w:rStyle w:val="NormalTok"/>
-        </w:rPr>
-        <w:t xml:space="preserve">)</w:t>
-      </w:r>
-      <w:r>
-        <w:br/>
-      </w:r>
-      <w:r>
-        <w:rPr>
-          <w:rStyle w:val="NormalTok"/>
-        </w:rPr>
-        <w:t xml:space="preserve">        </w:t>
-      </w:r>
-      <w:r>
-        <w:rPr>
-          <w:rStyle w:val="BuiltInTok"/>
-        </w:rPr>
-        <w:t xml:space="preserve">print</w:t>
-      </w:r>
-      <w:r>
-        <w:rPr>
-          <w:rStyle w:val="NormalTok"/>
-        </w:rPr>
-        <w:t xml:space="preserve">(</w:t>
-      </w:r>
-      <w:r>
-        <w:rPr>
-          <w:rStyle w:val="StringTok"/>
-        </w:rPr>
-        <w:t xml:space="preserve">"La empresa obtendría ganancias."</w:t>
-      </w:r>
-      <w:r>
-        <w:rPr>
-          <w:rStyle w:val="NormalTok"/>
-        </w:rPr>
-        <w:t xml:space="preserve">)</w:t>
-      </w:r>
-      <w:r>
-        <w:br/>
-      </w:r>
-      <w:r>
-        <w:rPr>
-          <w:rStyle w:val="NormalTok"/>
-        </w:rPr>
-        <w:t xml:space="preserve">    </w:t>
-      </w:r>
-      <w:r>
-        <w:rPr>
-          <w:rStyle w:val="ControlFlowTok"/>
-        </w:rPr>
-        <w:t xml:space="preserve">elif</w:t>
-      </w:r>
-      <w:r>
-        <w:rPr>
-          <w:rStyle w:val="NormalTok"/>
-        </w:rPr>
-        <w:t xml:space="preserve"> unidades_vender </w:t>
-      </w:r>
-      <w:r>
-        <w:rPr>
-          <w:rStyle w:val="OperatorTok"/>
-        </w:rPr>
-        <w:t xml:space="preserve">&lt;</w:t>
-      </w:r>
-      <w:r>
-        <w:rPr>
-          <w:rStyle w:val="NormalTok"/>
-        </w:rPr>
-        <w:t xml:space="preserve"> punto_equilibrio_unidades:</w:t>
-      </w:r>
-      <w:r>
-        <w:br/>
-      </w:r>
-      <w:r>
-        <w:rPr>
-          <w:rStyle w:val="NormalTok"/>
-        </w:rPr>
-        <w:t xml:space="preserve">        diferencia </w:t>
-      </w:r>
-      <w:r>
-        <w:rPr>
-          <w:rStyle w:val="OperatorTok"/>
-        </w:rPr>
-        <w:t xml:space="preserve">=</w:t>
-      </w:r>
-      <w:r>
-        <w:rPr>
-          <w:rStyle w:val="NormalTok"/>
-        </w:rPr>
-        <w:t xml:space="preserve"> punto_equilibrio_unidades </w:t>
-      </w:r>
-      <w:r>
-        <w:rPr>
-          <w:rStyle w:val="OperatorTok"/>
-        </w:rPr>
-        <w:t xml:space="preserve">-</w:t>
-      </w:r>
-      <w:r>
-        <w:rPr>
-          <w:rStyle w:val="NormalTok"/>
-        </w:rPr>
-        <w:t xml:space="preserve"> unidades_vender</w:t>
-      </w:r>
-      <w:r>
-        <w:br/>
-      </w:r>
-      <w:r>
-        <w:rPr>
-          <w:rStyle w:val="NormalTok"/>
-        </w:rPr>
-        <w:t xml:space="preserve">        perdida </w:t>
-      </w:r>
-      <w:r>
-        <w:rPr>
-          <w:rStyle w:val="OperatorTok"/>
-        </w:rPr>
-        <w:t xml:space="preserve">=</w:t>
-      </w:r>
-      <w:r>
-        <w:rPr>
-          <w:rStyle w:val="NormalTok"/>
-        </w:rPr>
-        <w:t xml:space="preserve"> diferencia </w:t>
-      </w:r>
-      <w:r>
-        <w:rPr>
-          <w:rStyle w:val="OperatorTok"/>
-        </w:rPr>
-        <w:t xml:space="preserve">*</w:t>
-      </w:r>
-      <w:r>
-        <w:rPr>
-          <w:rStyle w:val="NormalTok"/>
-        </w:rPr>
-        <w:t xml:space="preserve"> margen_contribucion_unitario</w:t>
-      </w:r>
-      <w:r>
-        <w:br/>
-      </w:r>
-      <w:r>
-        <w:rPr>
-          <w:rStyle w:val="NormalTok"/>
-        </w:rPr>
-        <w:t xml:space="preserve">        </w:t>
-      </w:r>
-      <w:r>
-        <w:rPr>
-          <w:rStyle w:val="BuiltInTok"/>
-        </w:rPr>
-        <w:t xml:space="preserve">print</w:t>
-      </w:r>
-      <w:r>
-        <w:rPr>
-          <w:rStyle w:val="NormalTok"/>
-        </w:rPr>
-        <w:t xml:space="preserve">(</w:t>
-      </w:r>
-      <w:r>
-        <w:rPr>
-          <w:rStyle w:val="SpecialStringTok"/>
-        </w:rPr>
-        <w:t xml:space="preserve">f"Pérdida esperada: S/ </w:t>
-      </w:r>
-      <w:r>
-        <w:rPr>
-          <w:rStyle w:val="SpecialCharTok"/>
-        </w:rPr>
-        <w:t xml:space="preserve">{</w:t>
-      </w:r>
-      <w:r>
-        <w:rPr>
-          <w:rStyle w:val="NormalTok"/>
-        </w:rPr>
-        <w:t xml:space="preserve">perdida</w:t>
-      </w:r>
-      <w:r>
-        <w:rPr>
-          <w:rStyle w:val="SpecialCharTok"/>
-        </w:rPr>
-        <w:t xml:space="preserve">:,.2f}</w:t>
-      </w:r>
-      <w:r>
-        <w:rPr>
-          <w:rStyle w:val="SpecialStringTok"/>
-        </w:rPr>
-        <w:t xml:space="preserve">"</w:t>
-      </w:r>
-      <w:r>
-        <w:rPr>
-          <w:rStyle w:val="NormalTok"/>
-        </w:rPr>
-        <w:t xml:space="preserve">)</w:t>
-      </w:r>
-      <w:r>
-        <w:br/>
-      </w:r>
-      <w:r>
-        <w:rPr>
-          <w:rStyle w:val="NormalTok"/>
-        </w:rPr>
-        <w:t xml:space="preserve">        </w:t>
-      </w:r>
-      <w:r>
-        <w:rPr>
-          <w:rStyle w:val="BuiltInTok"/>
-        </w:rPr>
-        <w:t xml:space="preserve">print</w:t>
-      </w:r>
-      <w:r>
-        <w:rPr>
-          <w:rStyle w:val="NormalTok"/>
-        </w:rPr>
-        <w:t xml:space="preserve">(</w:t>
-      </w:r>
-      <w:r>
-        <w:rPr>
-          <w:rStyle w:val="StringTok"/>
-        </w:rPr>
-        <w:t xml:space="preserve">"La empresa tendría pérdidas."</w:t>
-      </w:r>
-      <w:r>
-        <w:rPr>
-          <w:rStyle w:val="NormalTok"/>
-        </w:rPr>
-        <w:t xml:space="preserve">)</w:t>
-      </w:r>
-      <w:r>
-        <w:br/>
-      </w:r>
-      <w:r>
-        <w:rPr>
-          <w:rStyle w:val="NormalTok"/>
-        </w:rPr>
-        <w:t xml:space="preserve">    </w:t>
-      </w:r>
-      <w:r>
-        <w:rPr>
-          <w:rStyle w:val="ControlFlowTok"/>
-        </w:rPr>
-        <w:t xml:space="preserve">else</w:t>
-      </w:r>
-      <w:r>
-        <w:rPr>
-          <w:rStyle w:val="NormalTok"/>
-        </w:rPr>
-        <w:t xml:space="preserve">:</w:t>
-      </w:r>
-      <w:r>
-        <w:br/>
-      </w:r>
-      <w:r>
-        <w:rPr>
-          <w:rStyle w:val="NormalTok"/>
-        </w:rPr>
-        <w:t xml:space="preserve">        </w:t>
-      </w:r>
-      <w:r>
-        <w:rPr>
-          <w:rStyle w:val="BuiltInTok"/>
-        </w:rPr>
-        <w:t xml:space="preserve">print</w:t>
-      </w:r>
-      <w:r>
-        <w:rPr>
-          <w:rStyle w:val="NormalTok"/>
-        </w:rPr>
-        <w:t xml:space="preserve">(</w:t>
-      </w:r>
-      <w:r>
-        <w:rPr>
-          <w:rStyle w:val="StringTok"/>
-        </w:rPr>
         <w:t xml:space="preserve">"La empresa estaría en el punto de equilibrio (sin ganancias ni pérdidas)."</w:t>
       </w:r>
       <w:r>
-        <w:rPr>
-          <w:rStyle w:val="NormalTok"/>
-        </w:rPr>
-        <w:t xml:space="preserve">)</w:t>
+        <w:br/>
+      </w:r>
+      <w:r>
+        <w:rPr>
+          <w:rStyle w:val="NormalTok"/>
+        </w:rPr>
+        <w:t xml:space="preserve">        )</w:t>
       </w:r>
     </w:p>
     <w:bookmarkEnd w:id="83"/>
@@ -30021,12 +31665,6 @@
         <w:br/>
       </w:r>
       <w:r>
-        <w:rPr>
-          <w:rStyle w:val="NormalTok"/>
-        </w:rPr>
-        <w:t xml:space="preserve">    </w:t>
-      </w:r>
-      <w:r>
         <w:br/>
       </w:r>
       <w:r>
@@ -30410,7 +32048,7 @@
     </w:p>
     <w:bookmarkEnd w:id="85"/>
     <w:bookmarkEnd w:id="86"/>
-    <w:bookmarkStart w:id="87" w:name="conclusión"/>
+    <w:bookmarkStart w:id="89" w:name="conclusión"/>
     <w:p>
       <w:pPr>
         <w:pStyle w:val="Heading1"/>
@@ -30582,14 +32220,13 @@
         <w:t xml:space="preserve">Los comentarios documentan el código. Son esenciales para mantener código legible y mantenible.</w:t>
       </w:r>
     </w:p>
-    <w:bookmarkEnd w:id="87"/>
-    <w:bookmarkStart w:id="88" w:name="próximos-pasos"/>
+    <w:bookmarkStart w:id="87" w:name="próximos-pasos"/>
     <w:p>
       <w:pPr>
-        <w:pStyle w:val="Heading1"/>
+        <w:pStyle w:val="Heading2"/>
       </w:pPr>
       <w:r>
-        <w:t xml:space="preserve">12. Próximos pasos</w:t>
+        <w:t xml:space="preserve">11.1 Próximos pasos</w:t>
       </w:r>
     </w:p>
     <w:p>
@@ -30648,14 +32285,14 @@
         <w:t xml:space="preserve">Operaciones con estas estructuras aplicadas a economía</w:t>
       </w:r>
     </w:p>
-    <w:bookmarkEnd w:id="88"/>
-    <w:bookmarkStart w:id="89" w:name="recursos-adicionales"/>
+    <w:bookmarkEnd w:id="87"/>
+    <w:bookmarkStart w:id="88" w:name="recursos-adicionales"/>
     <w:p>
       <w:pPr>
-        <w:pStyle w:val="Heading1"/>
+        <w:pStyle w:val="Heading2"/>
       </w:pPr>
       <w:r>
-        <w:t xml:space="preserve">13. Recursos adicionales</w:t>
+        <w:t xml:space="preserve">11.2 Recursos adicionales</w:t>
       </w:r>
     </w:p>
     <w:p>
@@ -30702,6 +32339,7 @@
         <w:t xml:space="preserve">Exploración de bibliotecas como NumPy y Pandas</w:t>
       </w:r>
     </w:p>
+    <w:bookmarkEnd w:id="88"/>
     <w:bookmarkEnd w:id="89"/>
     <w:bookmarkStart w:id="118" w:name="publicaciones-similares"/>
     <w:p>
@@ -30709,7 +32347,7 @@
         <w:pStyle w:val="Heading1"/>
       </w:pPr>
       <w:r>
-        <w:t xml:space="preserve">14. Publicaciones Similares</w:t>
+        <w:t xml:space="preserve">12. Publicaciones Similares</w:t>
       </w:r>
     </w:p>
     <w:p>

</xml_diff>